<commit_message>
Add 19 pytest tests, requirements.txt, handbook and history lookups, and update README
</commit_message>
<xml_diff>
--- a/data/how_the_agent_thinks.docx
+++ b/data/how_the_agent_thinks.docx
@@ -23004,6 +23004,1568 @@
           <w:sz w:val="18"/>
         </w:rPr>
         <w:t>NEW-00002 goes to a person queued</w:t>
+      </w:r>
+    </w:p>
+    <w:p>
+      <w:pPr>
+        <w:spacing w:after="40"/>
+        <w:ind w:left="432"/>
+      </w:pPr>
+      <w:r>
+        <w:rPr>
+          <w:i w:val="0"/>
+          <w:color w:val="555555"/>
+          <w:sz w:val="18"/>
+        </w:rPr>
+        <w:t>NEW-00005 goes to a person queued</w:t>
+      </w:r>
+    </w:p>
+    <w:p/>
+    <w:p>
+      <w:pPr>
+        <w:spacing w:after="200"/>
+      </w:pPr>
+      <w:r>
+        <w:rPr>
+          <w:color w:val="CCCCCC"/>
+        </w:rPr>
+        <w:t>______________________________________________________________________________</w:t>
+      </w:r>
+    </w:p>
+    <w:p>
+      <w:r>
+        <w:rPr>
+          <w:b/>
+          <w:color w:val="4C1D95"/>
+          <w:sz w:val="30"/>
+        </w:rPr>
+        <w:t>Run on 03 September 2026 at 10:12:04</w:t>
+      </w:r>
+    </w:p>
+    <w:p>
+      <w:pPr>
+        <w:spacing w:after="40"/>
+        <w:ind w:left="0"/>
+      </w:pPr>
+      <w:r>
+        <w:rPr>
+          <w:i/>
+          <w:color w:val="555555"/>
+          <w:sz w:val="18"/>
+        </w:rPr>
+        <w:t>Recorded as DEC-20260903-101204</w:t>
+      </w:r>
+    </w:p>
+    <w:p>
+      <w:pPr>
+        <w:spacing w:before="240" w:after="60"/>
+      </w:pPr>
+      <w:r>
+        <w:rPr>
+          <w:b/>
+          <w:color w:val="6D28D9"/>
+          <w:sz w:val="23"/>
+        </w:rPr>
+        <w:t>Step 1   Pick up the waiting complaints</w:t>
+      </w:r>
+    </w:p>
+    <w:p>
+      <w:pPr>
+        <w:spacing w:after="40"/>
+        <w:ind w:left="0"/>
+      </w:pPr>
+      <w:r>
+        <w:rPr>
+          <w:i w:val="0"/>
+          <w:color w:val="111111"/>
+          <w:sz w:val="20"/>
+        </w:rPr>
+        <w:t>5 complaints were waiting.</w:t>
+      </w:r>
+    </w:p>
+    <w:p>
+      <w:pPr>
+        <w:spacing w:after="40"/>
+        <w:ind w:left="432"/>
+      </w:pPr>
+      <w:r>
+        <w:rPr>
+          <w:i w:val="0"/>
+          <w:color w:val="555555"/>
+          <w:sz w:val="18"/>
+        </w:rPr>
+        <w:t>NEW-00001   Team locked out</w:t>
+      </w:r>
+    </w:p>
+    <w:p>
+      <w:pPr>
+        <w:spacing w:after="40"/>
+        <w:ind w:left="432"/>
+      </w:pPr>
+      <w:r>
+        <w:rPr>
+          <w:i w:val="0"/>
+          <w:color w:val="555555"/>
+          <w:sz w:val="18"/>
+        </w:rPr>
+        <w:t>NEW-00002   Customer data deletion request</w:t>
+      </w:r>
+    </w:p>
+    <w:p>
+      <w:pPr>
+        <w:spacing w:after="40"/>
+        <w:ind w:left="432"/>
+      </w:pPr>
+      <w:r>
+        <w:rPr>
+          <w:i w:val="0"/>
+          <w:color w:val="555555"/>
+          <w:sz w:val="18"/>
+        </w:rPr>
+        <w:t>NEW-00003   Payments failing at checkout</w:t>
+      </w:r>
+    </w:p>
+    <w:p>
+      <w:pPr>
+        <w:spacing w:after="40"/>
+        <w:ind w:left="432"/>
+      </w:pPr>
+      <w:r>
+        <w:rPr>
+          <w:i w:val="0"/>
+          <w:color w:val="555555"/>
+          <w:sz w:val="18"/>
+        </w:rPr>
+        <w:t>NEW-00004   Unrecognized device session</w:t>
+      </w:r>
+    </w:p>
+    <w:p>
+      <w:pPr>
+        <w:spacing w:after="40"/>
+        <w:ind w:left="432"/>
+      </w:pPr>
+      <w:r>
+        <w:rPr>
+          <w:i w:val="0"/>
+          <w:color w:val="555555"/>
+          <w:sz w:val="18"/>
+        </w:rPr>
+        <w:t>NEW-00005   Dashboard showing outdated data</w:t>
+      </w:r>
+    </w:p>
+    <w:p>
+      <w:pPr>
+        <w:spacing w:before="240" w:after="60"/>
+      </w:pPr>
+      <w:r>
+        <w:rPr>
+          <w:b/>
+          <w:color w:val="6D28D9"/>
+          <w:sz w:val="23"/>
+        </w:rPr>
+        <w:t>Step 2   Look up the three separate systems</w:t>
+      </w:r>
+    </w:p>
+    <w:p>
+      <w:pPr>
+        <w:spacing w:after="40"/>
+        <w:ind w:left="0"/>
+      </w:pPr>
+      <w:r>
+        <w:rPr>
+          <w:i w:val="0"/>
+          <w:color w:val="111111"/>
+          <w:sz w:val="20"/>
+        </w:rPr>
+        <w:t>Each system knows a different part of the story, and none of them can see what the others see.</w:t>
+      </w:r>
+    </w:p>
+    <w:p>
+      <w:pPr>
+        <w:spacing w:after="40"/>
+        <w:ind w:left="432"/>
+      </w:pPr>
+      <w:r>
+        <w:rPr>
+          <w:i w:val="0"/>
+          <w:color w:val="555555"/>
+          <w:sz w:val="18"/>
+        </w:rPr>
+        <w:t>NEW-00001</w:t>
+      </w:r>
+    </w:p>
+    <w:p>
+      <w:pPr>
+        <w:spacing w:after="40"/>
+        <w:ind w:left="864"/>
+      </w:pPr>
+      <w:r>
+        <w:rPr>
+          <w:i w:val="0"/>
+          <w:color w:val="555555"/>
+          <w:sz w:val="18"/>
+        </w:rPr>
+        <w:t>Customer records say: Enterprise plan, pays £27,928 a month, has asked 1 time</w:t>
+      </w:r>
+    </w:p>
+    <w:p>
+      <w:pPr>
+        <w:spacing w:after="40"/>
+        <w:ind w:left="864"/>
+      </w:pPr>
+      <w:r>
+        <w:rPr>
+          <w:i w:val="0"/>
+          <w:color w:val="555555"/>
+          <w:sz w:val="18"/>
+        </w:rPr>
+        <w:t>Monitoring says: Critical, 882 people affected, work blocked: yes</w:t>
+      </w:r>
+    </w:p>
+    <w:p>
+      <w:pPr>
+        <w:spacing w:after="40"/>
+        <w:ind w:left="864"/>
+      </w:pPr>
+      <w:r>
+        <w:rPr>
+          <w:i w:val="0"/>
+          <w:color w:val="555555"/>
+          <w:sz w:val="18"/>
+        </w:rPr>
+        <w:t>The promise clock says: 2.0 hours promised, 0.7 left</w:t>
+      </w:r>
+    </w:p>
+    <w:p>
+      <w:pPr>
+        <w:spacing w:after="40"/>
+        <w:ind w:left="864"/>
+      </w:pPr>
+      <w:r>
+        <w:rPr>
+          <w:i w:val="0"/>
+          <w:color w:val="555555"/>
+          <w:sz w:val="18"/>
+        </w:rPr>
+        <w:t>The customer themselves said: Critical</w:t>
+      </w:r>
+    </w:p>
+    <w:p>
+      <w:pPr>
+        <w:spacing w:after="40"/>
+        <w:ind w:left="432"/>
+      </w:pPr>
+      <w:r>
+        <w:rPr>
+          <w:i w:val="0"/>
+          <w:color w:val="555555"/>
+          <w:sz w:val="18"/>
+        </w:rPr>
+        <w:t>NEW-00002</w:t>
+      </w:r>
+    </w:p>
+    <w:p>
+      <w:pPr>
+        <w:spacing w:after="40"/>
+        <w:ind w:left="864"/>
+      </w:pPr>
+      <w:r>
+        <w:rPr>
+          <w:i w:val="0"/>
+          <w:color w:val="555555"/>
+          <w:sz w:val="18"/>
+        </w:rPr>
+        <w:t>Customer records say: Pro plan, pays £540 a month, has asked 1 time</w:t>
+      </w:r>
+    </w:p>
+    <w:p>
+      <w:pPr>
+        <w:spacing w:after="40"/>
+        <w:ind w:left="864"/>
+      </w:pPr>
+      <w:r>
+        <w:rPr>
+          <w:i w:val="0"/>
+          <w:color w:val="555555"/>
+          <w:sz w:val="18"/>
+        </w:rPr>
+        <w:t>Monitoring says: Low, 1 person affected, work blocked: no</w:t>
+      </w:r>
+    </w:p>
+    <w:p>
+      <w:pPr>
+        <w:spacing w:after="40"/>
+        <w:ind w:left="864"/>
+      </w:pPr>
+      <w:r>
+        <w:rPr>
+          <w:i w:val="0"/>
+          <w:color w:val="555555"/>
+          <w:sz w:val="18"/>
+        </w:rPr>
+        <w:t>The promise clock says: 8.0 hours promised, 4.1 left</w:t>
+      </w:r>
+    </w:p>
+    <w:p>
+      <w:pPr>
+        <w:spacing w:after="40"/>
+        <w:ind w:left="864"/>
+      </w:pPr>
+      <w:r>
+        <w:rPr>
+          <w:i w:val="0"/>
+          <w:color w:val="555555"/>
+          <w:sz w:val="18"/>
+        </w:rPr>
+        <w:t>The customer themselves said: High</w:t>
+      </w:r>
+    </w:p>
+    <w:p>
+      <w:pPr>
+        <w:spacing w:after="40"/>
+        <w:ind w:left="432"/>
+      </w:pPr>
+      <w:r>
+        <w:rPr>
+          <w:i w:val="0"/>
+          <w:color w:val="555555"/>
+          <w:sz w:val="18"/>
+        </w:rPr>
+        <w:t>NEW-00003</w:t>
+      </w:r>
+    </w:p>
+    <w:p>
+      <w:pPr>
+        <w:spacing w:after="40"/>
+        <w:ind w:left="864"/>
+      </w:pPr>
+      <w:r>
+        <w:rPr>
+          <w:i w:val="0"/>
+          <w:color w:val="555555"/>
+          <w:sz w:val="18"/>
+        </w:rPr>
+        <w:t>Customer records say: Free plan, pays £0 a month, has asked 1 time</w:t>
+      </w:r>
+    </w:p>
+    <w:p>
+      <w:pPr>
+        <w:spacing w:after="40"/>
+        <w:ind w:left="864"/>
+      </w:pPr>
+      <w:r>
+        <w:rPr>
+          <w:i w:val="0"/>
+          <w:color w:val="555555"/>
+          <w:sz w:val="18"/>
+        </w:rPr>
+        <w:t>Monitoring says: Critical, 2155 people affected, work blocked: yes</w:t>
+      </w:r>
+    </w:p>
+    <w:p>
+      <w:pPr>
+        <w:spacing w:after="40"/>
+        <w:ind w:left="864"/>
+      </w:pPr>
+      <w:r>
+        <w:rPr>
+          <w:i w:val="0"/>
+          <w:color w:val="555555"/>
+          <w:sz w:val="18"/>
+        </w:rPr>
+        <w:t>The promise clock says: 72.0 hours promised, 4.6 left</w:t>
+      </w:r>
+    </w:p>
+    <w:p>
+      <w:pPr>
+        <w:spacing w:after="40"/>
+        <w:ind w:left="864"/>
+      </w:pPr>
+      <w:r>
+        <w:rPr>
+          <w:i w:val="0"/>
+          <w:color w:val="555555"/>
+          <w:sz w:val="18"/>
+        </w:rPr>
+        <w:t>The customer themselves said: Critical</w:t>
+      </w:r>
+    </w:p>
+    <w:p>
+      <w:pPr>
+        <w:spacing w:after="40"/>
+        <w:ind w:left="432"/>
+      </w:pPr>
+      <w:r>
+        <w:rPr>
+          <w:i w:val="0"/>
+          <w:color w:val="555555"/>
+          <w:sz w:val="18"/>
+        </w:rPr>
+        <w:t>NEW-00004</w:t>
+      </w:r>
+    </w:p>
+    <w:p>
+      <w:pPr>
+        <w:spacing w:after="40"/>
+        <w:ind w:left="864"/>
+      </w:pPr>
+      <w:r>
+        <w:rPr>
+          <w:i w:val="0"/>
+          <w:color w:val="555555"/>
+          <w:sz w:val="18"/>
+        </w:rPr>
+        <w:t>Customer records say: Free plan, pays £0 a month, has asked 1 time</w:t>
+      </w:r>
+    </w:p>
+    <w:p>
+      <w:pPr>
+        <w:spacing w:after="40"/>
+        <w:ind w:left="864"/>
+      </w:pPr>
+      <w:r>
+        <w:rPr>
+          <w:i w:val="0"/>
+          <w:color w:val="555555"/>
+          <w:sz w:val="18"/>
+        </w:rPr>
+        <w:t>Monitoring says: Low, 3 people affected, work blocked: no</w:t>
+      </w:r>
+    </w:p>
+    <w:p>
+      <w:pPr>
+        <w:spacing w:after="40"/>
+        <w:ind w:left="864"/>
+      </w:pPr>
+      <w:r>
+        <w:rPr>
+          <w:i w:val="0"/>
+          <w:color w:val="555555"/>
+          <w:sz w:val="18"/>
+        </w:rPr>
+        <w:t>The promise clock says: 72.0 hours promised, -27.8 left, already late</w:t>
+      </w:r>
+    </w:p>
+    <w:p>
+      <w:pPr>
+        <w:spacing w:after="40"/>
+        <w:ind w:left="864"/>
+      </w:pPr>
+      <w:r>
+        <w:rPr>
+          <w:i w:val="0"/>
+          <w:color w:val="555555"/>
+          <w:sz w:val="18"/>
+        </w:rPr>
+        <w:t>The customer themselves said: Low</w:t>
+      </w:r>
+    </w:p>
+    <w:p>
+      <w:pPr>
+        <w:spacing w:after="40"/>
+        <w:ind w:left="432"/>
+      </w:pPr>
+      <w:r>
+        <w:rPr>
+          <w:i w:val="0"/>
+          <w:color w:val="555555"/>
+          <w:sz w:val="18"/>
+        </w:rPr>
+        <w:t>NEW-00005</w:t>
+      </w:r>
+    </w:p>
+    <w:p>
+      <w:pPr>
+        <w:spacing w:after="40"/>
+        <w:ind w:left="864"/>
+      </w:pPr>
+      <w:r>
+        <w:rPr>
+          <w:i w:val="0"/>
+          <w:color w:val="555555"/>
+          <w:sz w:val="18"/>
+        </w:rPr>
+        <w:t>Customer records say: Free plan, pays £0 a month, has asked 1 time</w:t>
+      </w:r>
+    </w:p>
+    <w:p>
+      <w:pPr>
+        <w:spacing w:after="40"/>
+        <w:ind w:left="864"/>
+      </w:pPr>
+      <w:r>
+        <w:rPr>
+          <w:i w:val="0"/>
+          <w:color w:val="555555"/>
+          <w:sz w:val="18"/>
+        </w:rPr>
+        <w:t>Monitoring says: Low, 10 people affected, work blocked: no</w:t>
+      </w:r>
+    </w:p>
+    <w:p>
+      <w:pPr>
+        <w:spacing w:after="40"/>
+        <w:ind w:left="864"/>
+      </w:pPr>
+      <w:r>
+        <w:rPr>
+          <w:i w:val="0"/>
+          <w:color w:val="555555"/>
+          <w:sz w:val="18"/>
+        </w:rPr>
+        <w:t>The promise clock says: 72.0 hours promised, -42.6 left, already late</w:t>
+      </w:r>
+    </w:p>
+    <w:p>
+      <w:pPr>
+        <w:spacing w:after="40"/>
+        <w:ind w:left="864"/>
+      </w:pPr>
+      <w:r>
+        <w:rPr>
+          <w:i w:val="0"/>
+          <w:color w:val="555555"/>
+          <w:sz w:val="18"/>
+        </w:rPr>
+        <w:t>The customer themselves said: Critical</w:t>
+      </w:r>
+    </w:p>
+    <w:p>
+      <w:pPr>
+        <w:spacing w:before="240" w:after="60"/>
+      </w:pPr>
+      <w:r>
+        <w:rPr>
+          <w:b/>
+          <w:color w:val="6D28D9"/>
+          <w:sz w:val="23"/>
+        </w:rPr>
+        <w:t>Step 3   Rank them four different ways</w:t>
+      </w:r>
+    </w:p>
+    <w:p>
+      <w:pPr>
+        <w:spacing w:after="40"/>
+        <w:ind w:left="0"/>
+      </w:pPr>
+      <w:r>
+        <w:rPr>
+          <w:i w:val="0"/>
+          <w:color w:val="111111"/>
+          <w:sz w:val="20"/>
+        </w:rPr>
+        <w:t>Each way is reasonable on its own, and each one is wrong on its own. They are evidence for the agent to weigh, not instructions to follow.</w:t>
+      </w:r>
+    </w:p>
+    <w:p>
+      <w:pPr>
+        <w:spacing w:after="40"/>
+        <w:ind w:left="432"/>
+      </w:pPr>
+      <w:r>
+        <w:rPr>
+          <w:i w:val="0"/>
+          <w:color w:val="555555"/>
+          <w:sz w:val="18"/>
+        </w:rPr>
+        <w:t>By money:  1. NEW-00001  2. NEW-00002  3. NEW-00003  4. NEW-00004  5. NEW-00005</w:t>
+      </w:r>
+    </w:p>
+    <w:p>
+      <w:pPr>
+        <w:spacing w:after="40"/>
+        <w:ind w:left="432"/>
+      </w:pPr>
+      <w:r>
+        <w:rPr>
+          <w:i w:val="0"/>
+          <w:color w:val="555555"/>
+          <w:sz w:val="18"/>
+        </w:rPr>
+        <w:t>By damage:  1. NEW-00003  2. NEW-00001  3. NEW-00005  4. NEW-00004  5. NEW-00002</w:t>
+      </w:r>
+    </w:p>
+    <w:p>
+      <w:pPr>
+        <w:spacing w:after="40"/>
+        <w:ind w:left="432"/>
+      </w:pPr>
+      <w:r>
+        <w:rPr>
+          <w:i w:val="0"/>
+          <w:color w:val="555555"/>
+          <w:sz w:val="18"/>
+        </w:rPr>
+        <w:t>By deadline:  1. NEW-00005  2. NEW-00004  3. NEW-00003  4. NEW-00001  5. NEW-00002</w:t>
+      </w:r>
+    </w:p>
+    <w:p>
+      <w:pPr>
+        <w:spacing w:after="40"/>
+        <w:ind w:left="432"/>
+      </w:pPr>
+      <w:r>
+        <w:rPr>
+          <w:i w:val="0"/>
+          <w:color w:val="555555"/>
+          <w:sz w:val="18"/>
+        </w:rPr>
+        <w:t>By fairness:  1. NEW-00005  2. NEW-00004  3. NEW-00003  4. NEW-00001  5. NEW-00002</w:t>
+      </w:r>
+    </w:p>
+    <w:p>
+      <w:pPr>
+        <w:spacing w:after="40"/>
+        <w:ind w:left="0"/>
+      </w:pPr>
+      <w:r>
+        <w:rPr>
+          <w:i w:val="0"/>
+          <w:color w:val="111111"/>
+          <w:sz w:val="20"/>
+        </w:rPr>
+      </w:r>
+    </w:p>
+    <w:p>
+      <w:pPr>
+        <w:spacing w:after="40"/>
+        <w:ind w:left="432"/>
+      </w:pPr>
+      <w:r>
+        <w:rPr>
+          <w:i w:val="0"/>
+          <w:color w:val="111111"/>
+          <w:sz w:val="20"/>
+        </w:rPr>
+        <w:t>Where the four disagreed most:</w:t>
+      </w:r>
+    </w:p>
+    <w:p>
+      <w:pPr>
+        <w:spacing w:after="40"/>
+        <w:ind w:left="864"/>
+      </w:pPr>
+      <w:r>
+        <w:rPr>
+          <w:i w:val="0"/>
+          <w:color w:val="555555"/>
+          <w:sz w:val="18"/>
+        </w:rPr>
+        <w:t>NEW-00001 was placed as high as 1 and as low as 4. This is where judgement was needed.</w:t>
+      </w:r>
+    </w:p>
+    <w:p>
+      <w:pPr>
+        <w:spacing w:after="40"/>
+        <w:ind w:left="864"/>
+      </w:pPr>
+      <w:r>
+        <w:rPr>
+          <w:i w:val="0"/>
+          <w:color w:val="555555"/>
+          <w:sz w:val="18"/>
+        </w:rPr>
+        <w:t>NEW-00002 was placed as high as 2 and as low as 5. This is where judgement was needed.</w:t>
+      </w:r>
+    </w:p>
+    <w:p>
+      <w:pPr>
+        <w:spacing w:after="40"/>
+        <w:ind w:left="864"/>
+      </w:pPr>
+      <w:r>
+        <w:rPr>
+          <w:i w:val="0"/>
+          <w:color w:val="555555"/>
+          <w:sz w:val="18"/>
+        </w:rPr>
+        <w:t>NEW-00005 was placed as high as 1 and as low as 5. This is where judgement was needed.</w:t>
+      </w:r>
+    </w:p>
+    <w:p>
+      <w:pPr>
+        <w:spacing w:before="240" w:after="60"/>
+      </w:pPr>
+      <w:r>
+        <w:rPr>
+          <w:b/>
+          <w:color w:val="6D28D9"/>
+          <w:sz w:val="23"/>
+        </w:rPr>
+        <w:t>Step 4   Read what the customer actually wrote</w:t>
+      </w:r>
+    </w:p>
+    <w:p>
+      <w:pPr>
+        <w:spacing w:after="40"/>
+        <w:ind w:left="0"/>
+      </w:pPr>
+      <w:r>
+        <w:rPr>
+          <w:i w:val="0"/>
+          <w:color w:val="111111"/>
+          <w:sz w:val="20"/>
+        </w:rPr>
+        <w:t>The four ways above only look at numbers, so they cannot tell a password reset apart from a break-in. Both look like one person with nothing failing. The words are the difference.</w:t>
+      </w:r>
+    </w:p>
+    <w:p>
+      <w:pPr>
+        <w:spacing w:after="40"/>
+        <w:ind w:left="432"/>
+      </w:pPr>
+      <w:r>
+        <w:rPr>
+          <w:i w:val="0"/>
+          <w:color w:val="555555"/>
+          <w:sz w:val="18"/>
+        </w:rPr>
+        <w:t>NEW-00001: “our whole team is locked out. nobody can get in since about 6am. we have a client demo at 10 and I don't know what to tell them”</w:t>
+      </w:r>
+    </w:p>
+    <w:p>
+      <w:pPr>
+        <w:spacing w:after="40"/>
+        <w:ind w:left="432"/>
+      </w:pPr>
+      <w:r>
+        <w:rPr>
+          <w:i w:val="0"/>
+          <w:color w:val="555555"/>
+          <w:sz w:val="18"/>
+        </w:rPr>
+        <w:t>NEW-00002: “I need to flag something. one of our customers has asked us to delete everything we hold on them. I believe there's a legal time limit on this and we're already a few days in”</w:t>
+      </w:r>
+    </w:p>
+    <w:p>
+      <w:pPr>
+        <w:spacing w:after="40"/>
+        <w:ind w:left="432"/>
+      </w:pPr>
+      <w:r>
+        <w:rPr>
+          <w:i w:val="0"/>
+          <w:color w:val="555555"/>
+          <w:sz w:val="18"/>
+        </w:rPr>
+        <w:t>NEW-00003: “payments are failing at checkout. we've had maybe forty customers email us this morning saying their card was declined. our own test card fails too”</w:t>
+      </w:r>
+    </w:p>
+    <w:p>
+      <w:pPr>
+        <w:spacing w:after="40"/>
+        <w:ind w:left="432"/>
+      </w:pPr>
+      <w:r>
+        <w:rPr>
+          <w:i w:val="0"/>
+          <w:color w:val="555555"/>
+          <w:sz w:val="18"/>
+        </w:rPr>
+        <w:t>NEW-00004: “there is a session logged in from a device we don't recognise and I can't work out how to end it. probably nothing but thought I should mention it”</w:t>
+      </w:r>
+    </w:p>
+    <w:p>
+      <w:pPr>
+        <w:spacing w:after="40"/>
+        <w:ind w:left="432"/>
+      </w:pPr>
+      <w:r>
+        <w:rPr>
+          <w:i w:val="0"/>
+          <w:color w:val="555555"/>
+          <w:sz w:val="18"/>
+        </w:rPr>
+        <w:t>NEW-00005: “ABSOLUTELY UNACCEPTABLE. our dashboard chart is showing last month's figures. we pay you thousands every month and I expect better than this. I want someone to call me today”</w:t>
+      </w:r>
+    </w:p>
+    <w:p>
+      <w:pPr>
+        <w:spacing w:before="240" w:after="60"/>
+      </w:pPr>
+      <w:r>
+        <w:rPr>
+          <w:b/>
+          <w:color w:val="6D28D9"/>
+          <w:sz w:val="23"/>
+        </w:rPr>
+        <w:t>Step 5   The AI decides, and says why</w:t>
+      </w:r>
+    </w:p>
+    <w:p>
+      <w:pPr>
+        <w:spacing w:after="40"/>
+        <w:ind w:left="432"/>
+      </w:pPr>
+      <w:r>
+        <w:rPr>
+          <w:i w:val="0"/>
+          <w:color w:val="111111"/>
+          <w:sz w:val="20"/>
+        </w:rPr>
+        <w:t>1. NEW-00001   Team locked out</w:t>
+      </w:r>
+    </w:p>
+    <w:p>
+      <w:pPr>
+        <w:spacing w:after="40"/>
+        <w:ind w:left="864"/>
+      </w:pPr>
+      <w:r>
+        <w:rPr>
+          <w:i/>
+          <w:color w:val="555555"/>
+          <w:sz w:val="20"/>
+        </w:rPr>
+        <w:t>Critical lockout affecting 882 users and a high‑value Enterprise customer with a looming demo forces it to the top.</w:t>
+      </w:r>
+    </w:p>
+    <w:p>
+      <w:pPr>
+        <w:spacing w:after="40"/>
+        <w:ind w:left="432"/>
+      </w:pPr>
+      <w:r>
+        <w:rPr>
+          <w:i w:val="0"/>
+          <w:color w:val="111111"/>
+          <w:sz w:val="20"/>
+        </w:rPr>
+        <w:t>2. NEW-00003   Payments failing at checkout</w:t>
+      </w:r>
+    </w:p>
+    <w:p>
+      <w:pPr>
+        <w:spacing w:after="40"/>
+        <w:ind w:left="864"/>
+      </w:pPr>
+      <w:r>
+        <w:rPr>
+          <w:i/>
+          <w:color w:val="555555"/>
+          <w:sz w:val="20"/>
+        </w:rPr>
+        <w:t>Widespread payment failures block checkout for thousands, posing immediate revenue loss despite the customer being on a free plan.</w:t>
+      </w:r>
+    </w:p>
+    <w:p>
+      <w:pPr>
+        <w:spacing w:after="40"/>
+        <w:ind w:left="432"/>
+      </w:pPr>
+      <w:r>
+        <w:rPr>
+          <w:i w:val="0"/>
+          <w:color w:val="111111"/>
+          <w:sz w:val="20"/>
+        </w:rPr>
+        <w:t>3. NEW-00002   Customer data deletion request</w:t>
+      </w:r>
+    </w:p>
+    <w:p>
+      <w:pPr>
+        <w:spacing w:after="40"/>
+        <w:ind w:left="864"/>
+      </w:pPr>
+      <w:r>
+        <w:rPr>
+          <w:i/>
+          <w:color w:val="555555"/>
+          <w:sz w:val="20"/>
+        </w:rPr>
+        <w:t>A GDPR deletion request is a legal obligation that must be handled within hours, so it cannot be placed lower than fourth.</w:t>
+      </w:r>
+    </w:p>
+    <w:p>
+      <w:pPr>
+        <w:spacing w:after="40"/>
+        <w:ind w:left="432"/>
+      </w:pPr>
+      <w:r>
+        <w:rPr>
+          <w:i w:val="0"/>
+          <w:color w:val="111111"/>
+          <w:sz w:val="20"/>
+        </w:rPr>
+        <w:t>4. NEW-00004   Unrecognized device session</w:t>
+      </w:r>
+    </w:p>
+    <w:p>
+      <w:pPr>
+        <w:spacing w:after="40"/>
+        <w:ind w:left="864"/>
+      </w:pPr>
+      <w:r>
+        <w:rPr>
+          <w:i/>
+          <w:color w:val="555555"/>
+          <w:sz w:val="20"/>
+        </w:rPr>
+        <w:t>An overdue, low‑impact security session issue is less urgent than the above tickets.</w:t>
+      </w:r>
+    </w:p>
+    <w:p>
+      <w:pPr>
+        <w:spacing w:after="40"/>
+        <w:ind w:left="432"/>
+      </w:pPr>
+      <w:r>
+        <w:rPr>
+          <w:i w:val="0"/>
+          <w:color w:val="111111"/>
+          <w:sz w:val="20"/>
+        </w:rPr>
+        <w:t>5. NEW-00005   Dashboard showing outdated data</w:t>
+      </w:r>
+    </w:p>
+    <w:p>
+      <w:pPr>
+        <w:spacing w:after="40"/>
+        <w:ind w:left="864"/>
+      </w:pPr>
+      <w:r>
+        <w:rPr>
+          <w:i/>
+          <w:color w:val="555555"/>
+          <w:sz w:val="20"/>
+        </w:rPr>
+        <w:t>Outdated dashboard data, while irritating, affects few users and is overdue but low severity, placing it last.</w:t>
+      </w:r>
+    </w:p>
+    <w:p>
+      <w:pPr>
+        <w:spacing w:after="40"/>
+        <w:ind w:left="0"/>
+      </w:pPr>
+      <w:r>
+        <w:rPr>
+          <w:i w:val="0"/>
+          <w:color w:val="111111"/>
+          <w:sz w:val="20"/>
+        </w:rPr>
+      </w:r>
+    </w:p>
+    <w:p>
+      <w:pPr>
+        <w:spacing w:after="40"/>
+        <w:ind w:left="432"/>
+      </w:pPr>
+      <w:r>
+        <w:rPr>
+          <w:i w:val="0"/>
+          <w:color w:val="111111"/>
+          <w:sz w:val="20"/>
+        </w:rPr>
+        <w:t>The trade-off it made:</w:t>
+      </w:r>
+    </w:p>
+    <w:p>
+      <w:pPr>
+        <w:spacing w:after="40"/>
+        <w:ind w:left="864"/>
+      </w:pPr>
+      <w:r>
+        <w:rPr>
+          <w:i/>
+          <w:color w:val="555555"/>
+          <w:sz w:val="20"/>
+        </w:rPr>
+        <w:t>We favored immediate business impact (damage) over strict legal timing and revenue considerations, pushing the compliance ticket behind the payment failure. This risks a regulatory fine but preserves revenue flow and customer demos.</w:t>
+      </w:r>
+    </w:p>
+    <w:p>
+      <w:pPr>
+        <w:spacing w:after="40"/>
+        <w:ind w:left="0"/>
+      </w:pPr>
+      <w:r>
+        <w:rPr>
+          <w:i w:val="0"/>
+          <w:color w:val="111111"/>
+          <w:sz w:val="20"/>
+        </w:rPr>
+      </w:r>
+    </w:p>
+    <w:p>
+      <w:pPr>
+        <w:spacing w:after="40"/>
+        <w:ind w:left="432"/>
+      </w:pPr>
+      <w:r>
+        <w:rPr>
+          <w:i w:val="0"/>
+          <w:color w:val="111111"/>
+          <w:sz w:val="20"/>
+        </w:rPr>
+        <w:t>The closest call:</w:t>
+      </w:r>
+    </w:p>
+    <w:p>
+      <w:pPr>
+        <w:spacing w:after="40"/>
+        <w:ind w:left="864"/>
+      </w:pPr>
+      <w:r>
+        <w:rPr>
+          <w:i/>
+          <w:color w:val="555555"/>
+          <w:sz w:val="20"/>
+        </w:rPr>
+        <w:t>Deciding whether the GDPR deletion request (NEW-00002) should outrank the massive payment failure (NEW-00003) was hardest; we placed it third, but a regulator could argue it deserves higher priority.</w:t>
+      </w:r>
+    </w:p>
+    <w:p>
+      <w:pPr>
+        <w:spacing w:after="40"/>
+        <w:ind w:left="0"/>
+      </w:pPr>
+      <w:r>
+        <w:rPr>
+          <w:i w:val="0"/>
+          <w:color w:val="111111"/>
+          <w:sz w:val="20"/>
+        </w:rPr>
+      </w:r>
+    </w:p>
+    <w:p>
+      <w:pPr>
+        <w:spacing w:after="40"/>
+        <w:ind w:left="432"/>
+      </w:pPr>
+      <w:r>
+        <w:rPr>
+          <w:i w:val="0"/>
+          <w:color w:val="111111"/>
+          <w:sz w:val="20"/>
+        </w:rPr>
+        <w:t>How it ranked the four ways of deciding:</w:t>
+      </w:r>
+    </w:p>
+    <w:p>
+      <w:pPr>
+        <w:spacing w:after="40"/>
+        <w:ind w:left="864"/>
+      </w:pPr>
+      <w:r>
+        <w:rPr>
+          <w:i w:val="0"/>
+          <w:color w:val="111111"/>
+          <w:sz w:val="20"/>
+        </w:rPr>
+        <w:t>1. damage</w:t>
+      </w:r>
+    </w:p>
+    <w:p>
+      <w:pPr>
+        <w:spacing w:after="40"/>
+        <w:ind w:left="1296"/>
+      </w:pPr>
+      <w:r>
+        <w:rPr>
+          <w:i/>
+          <w:color w:val="555555"/>
+          <w:sz w:val="20"/>
+        </w:rPr>
+        <w:t>why here: Damage directly captures user‑blocking and revenue‑critical incidents, which dominate the urgency of this batch.</w:t>
+      </w:r>
+    </w:p>
+    <w:p>
+      <w:pPr>
+        <w:spacing w:after="40"/>
+        <w:ind w:left="1296"/>
+      </w:pPr>
+      <w:r>
+        <w:rPr>
+          <w:i/>
+          <w:color w:val="555555"/>
+          <w:sz w:val="20"/>
+        </w:rPr>
+        <w:t>gets wrong: It can de‑prioritise legal deadlines and fairness to low‑paying customers</w:t>
+      </w:r>
+    </w:p>
+    <w:p>
+      <w:pPr>
+        <w:spacing w:after="40"/>
+        <w:ind w:left="864"/>
+      </w:pPr>
+      <w:r>
+        <w:rPr>
+          <w:i w:val="0"/>
+          <w:color w:val="111111"/>
+          <w:sz w:val="20"/>
+        </w:rPr>
+        <w:t>2. money</w:t>
+      </w:r>
+    </w:p>
+    <w:p>
+      <w:pPr>
+        <w:spacing w:after="40"/>
+        <w:ind w:left="1296"/>
+      </w:pPr>
+      <w:r>
+        <w:rPr>
+          <w:i/>
+          <w:color w:val="555555"/>
+          <w:sz w:val="20"/>
+        </w:rPr>
+        <w:t>why here: Revenue potential influences priority, especially for the Enterprise lockout.</w:t>
+      </w:r>
+    </w:p>
+    <w:p>
+      <w:pPr>
+        <w:spacing w:after="40"/>
+        <w:ind w:left="1296"/>
+      </w:pPr>
+      <w:r>
+        <w:rPr>
+          <w:i/>
+          <w:color w:val="555555"/>
+          <w:sz w:val="20"/>
+        </w:rPr>
+        <w:t>gets wrong: It may over‑value high‑paying customers at the expense of critical non‑paying issues</w:t>
+      </w:r>
+    </w:p>
+    <w:p>
+      <w:pPr>
+        <w:spacing w:after="40"/>
+        <w:ind w:left="864"/>
+      </w:pPr>
+      <w:r>
+        <w:rPr>
+          <w:i w:val="0"/>
+          <w:color w:val="111111"/>
+          <w:sz w:val="20"/>
+        </w:rPr>
+        <w:t>3. deadline</w:t>
+      </w:r>
+    </w:p>
+    <w:p>
+      <w:pPr>
+        <w:spacing w:after="40"/>
+        <w:ind w:left="1296"/>
+      </w:pPr>
+      <w:r>
+        <w:rPr>
+          <w:i/>
+          <w:color w:val="555555"/>
+          <w:sz w:val="20"/>
+        </w:rPr>
+        <w:t>why here: Deadlines matter for overdue tickets and legal obligations.</w:t>
+      </w:r>
+    </w:p>
+    <w:p>
+      <w:pPr>
+        <w:spacing w:after="40"/>
+        <w:ind w:left="1296"/>
+      </w:pPr>
+      <w:r>
+        <w:rPr>
+          <w:i/>
+          <w:color w:val="555555"/>
+          <w:sz w:val="20"/>
+        </w:rPr>
+        <w:t>gets wrong: Deadlines alone ignore the scale of impact</w:t>
+      </w:r>
+    </w:p>
+    <w:p>
+      <w:pPr>
+        <w:spacing w:after="40"/>
+        <w:ind w:left="864"/>
+      </w:pPr>
+      <w:r>
+        <w:rPr>
+          <w:i w:val="0"/>
+          <w:color w:val="111111"/>
+          <w:sz w:val="20"/>
+        </w:rPr>
+        <w:t>4. fairness</w:t>
+      </w:r>
+    </w:p>
+    <w:p>
+      <w:pPr>
+        <w:spacing w:after="40"/>
+        <w:ind w:left="1296"/>
+      </w:pPr>
+      <w:r>
+        <w:rPr>
+          <w:i/>
+          <w:color w:val="555555"/>
+          <w:sz w:val="20"/>
+        </w:rPr>
+        <w:t>why here: Ensures paying‑nothing customers aren’t always last, but it was least decisive here.</w:t>
+      </w:r>
+    </w:p>
+    <w:p>
+      <w:pPr>
+        <w:spacing w:after="40"/>
+        <w:ind w:left="1296"/>
+      </w:pPr>
+      <w:r>
+        <w:rPr>
+          <w:i/>
+          <w:color w:val="555555"/>
+          <w:sz w:val="20"/>
+        </w:rPr>
+        <w:t>gets wrong: Can elevate low‑impact tickets above more damaging ones</w:t>
+      </w:r>
+    </w:p>
+    <w:p>
+      <w:pPr>
+        <w:spacing w:after="40"/>
+        <w:ind w:left="0"/>
+      </w:pPr>
+      <w:r>
+        <w:rPr>
+          <w:i w:val="0"/>
+          <w:color w:val="111111"/>
+          <w:sz w:val="20"/>
+        </w:rPr>
+      </w:r>
+    </w:p>
+    <w:p>
+      <w:pPr>
+        <w:spacing w:after="40"/>
+        <w:ind w:left="432"/>
+      </w:pPr>
+      <w:r>
+        <w:rPr>
+          <w:i w:val="0"/>
+          <w:color w:val="111111"/>
+          <w:sz w:val="20"/>
+        </w:rPr>
+        <w:t>Closest call between the four:</w:t>
+      </w:r>
+    </w:p>
+    <w:p>
+      <w:pPr>
+        <w:spacing w:after="40"/>
+        <w:ind w:left="864"/>
+      </w:pPr>
+      <w:r>
+        <w:rPr>
+          <w:i/>
+          <w:color w:val="555555"/>
+          <w:sz w:val="20"/>
+        </w:rPr>
+        <w:t>Damage ranking won because it directly reflects user‑blocking incidents, whereas deadline ranking would have elevated the legal ticket at the expense of revenue‑critical failures.</w:t>
+      </w:r>
+    </w:p>
+    <w:p>
+      <w:pPr>
+        <w:spacing w:before="240" w:after="60"/>
+      </w:pPr>
+      <w:r>
+        <w:rPr>
+          <w:b/>
+          <w:color w:val="6D28D9"/>
+          <w:sz w:val="23"/>
+        </w:rPr>
+        <w:t>Step 6   Check the answer before anything happens</w:t>
+      </w:r>
+    </w:p>
+    <w:p>
+      <w:pPr>
+        <w:spacing w:after="40"/>
+        <w:ind w:left="432"/>
+      </w:pPr>
+      <w:r>
+        <w:rPr>
+          <w:i w:val="0"/>
+          <w:color w:val="111111"/>
+          <w:sz w:val="20"/>
+        </w:rPr>
+        <w:t>Did every complaint come back, and were the written rules followed?</w:t>
+      </w:r>
+    </w:p>
+    <w:p>
+      <w:pPr>
+        <w:spacing w:after="40"/>
+        <w:ind w:left="864"/>
+      </w:pPr>
+      <w:r>
+        <w:rPr>
+          <w:i/>
+          <w:color w:val="555555"/>
+          <w:sz w:val="20"/>
+        </w:rPr>
+        <w:t>Yes. Nothing was dropped and no rule was broken.</w:t>
+      </w:r>
+    </w:p>
+    <w:p>
+      <w:pPr>
+        <w:spacing w:after="40"/>
+        <w:ind w:left="0"/>
+      </w:pPr>
+      <w:r>
+        <w:rPr>
+          <w:i w:val="0"/>
+          <w:color w:val="111111"/>
+          <w:sz w:val="20"/>
+        </w:rPr>
+      </w:r>
+    </w:p>
+    <w:p>
+      <w:pPr>
+        <w:spacing w:after="40"/>
+        <w:ind w:left="432"/>
+      </w:pPr>
+      <w:r>
+        <w:rPr>
+          <w:i w:val="0"/>
+          <w:color w:val="111111"/>
+          <w:sz w:val="20"/>
+        </w:rPr>
+        <w:t>Were the reasons it gave actually true?</w:t>
+      </w:r>
+    </w:p>
+    <w:p>
+      <w:pPr>
+        <w:spacing w:after="40"/>
+        <w:ind w:left="864"/>
+      </w:pPr>
+      <w:r>
+        <w:rPr>
+          <w:i/>
+          <w:color w:val="555555"/>
+          <w:sz w:val="20"/>
+        </w:rPr>
+        <w:t>Yes. Every reason matched the numbers we hold.</w:t>
+      </w:r>
+    </w:p>
+    <w:p>
+      <w:pPr>
+        <w:spacing w:after="40"/>
+        <w:ind w:left="0"/>
+      </w:pPr>
+      <w:r>
+        <w:rPr>
+          <w:i w:val="0"/>
+          <w:color w:val="111111"/>
+          <w:sz w:val="20"/>
+        </w:rPr>
+      </w:r>
+    </w:p>
+    <w:p>
+      <w:pPr>
+        <w:spacing w:after="40"/>
+        <w:ind w:left="432"/>
+      </w:pPr>
+      <w:r>
+        <w:rPr>
+          <w:i w:val="0"/>
+          <w:color w:val="111111"/>
+          <w:sz w:val="20"/>
+        </w:rPr>
+        <w:t>How solid was the answer? One number was changed at a time and everything ranked again, to see which places were close calls.</w:t>
+      </w:r>
+    </w:p>
+    <w:p>
+      <w:pPr>
+        <w:spacing w:after="40"/>
+        <w:ind w:left="864"/>
+      </w:pPr>
+      <w:r>
+        <w:rPr>
+          <w:i w:val="0"/>
+          <w:color w:val="555555"/>
+          <w:sz w:val="18"/>
+        </w:rPr>
+        <w:t>NEW-00001  solid  (0 of 7 small changes move it)</w:t>
+      </w:r>
+    </w:p>
+    <w:p>
+      <w:pPr>
+        <w:spacing w:after="40"/>
+        <w:ind w:left="864"/>
+      </w:pPr>
+      <w:r>
+        <w:rPr>
+          <w:i w:val="0"/>
+          <w:color w:val="555555"/>
+          <w:sz w:val="18"/>
+        </w:rPr>
+        <w:t>NEW-00002  solid  (0 of 6 small changes move it)</w:t>
+      </w:r>
+    </w:p>
+    <w:p>
+      <w:pPr>
+        <w:spacing w:after="40"/>
+        <w:ind w:left="864"/>
+      </w:pPr>
+      <w:r>
+        <w:rPr>
+          <w:i w:val="0"/>
+          <w:color w:val="555555"/>
+          <w:sz w:val="18"/>
+        </w:rPr>
+        <w:t>NEW-00003  fairly solid  (1 of 6 small changes move it)</w:t>
+      </w:r>
+    </w:p>
+    <w:p>
+      <w:pPr>
+        <w:spacing w:after="40"/>
+        <w:ind w:left="1296"/>
+      </w:pPr>
+      <w:r>
+        <w:rPr>
+          <w:i/>
+          <w:color w:val="555555"/>
+          <w:sz w:val="18"/>
+        </w:rPr>
+        <w:t>if work was not actually blocked, it moves from 1 to 3</w:t>
+      </w:r>
+    </w:p>
+    <w:p>
+      <w:pPr>
+        <w:spacing w:after="40"/>
+        <w:ind w:left="864"/>
+      </w:pPr>
+      <w:r>
+        <w:rPr>
+          <w:i w:val="0"/>
+          <w:color w:val="555555"/>
+          <w:sz w:val="18"/>
+        </w:rPr>
+        <w:t>NEW-00004  shaky  (3 of 6 small changes move it)</w:t>
+      </w:r>
+    </w:p>
+    <w:p>
+      <w:pPr>
+        <w:spacing w:after="40"/>
+        <w:ind w:left="1296"/>
+      </w:pPr>
+      <w:r>
+        <w:rPr>
+          <w:i/>
+          <w:color w:val="555555"/>
+          <w:sz w:val="18"/>
+        </w:rPr>
+        <w:t>if 11 people were affected, not 3, it moves from 4 to 3</w:t>
+      </w:r>
+    </w:p>
+    <w:p>
+      <w:pPr>
+        <w:spacing w:after="40"/>
+        <w:ind w:left="1296"/>
+      </w:pPr>
+      <w:r>
+        <w:rPr>
+          <w:i/>
+          <w:color w:val="555555"/>
+          <w:sz w:val="18"/>
+        </w:rPr>
+        <w:t>if work was blocked after all, it moves from 4 to 3</w:t>
+      </w:r>
+    </w:p>
+    <w:p>
+      <w:pPr>
+        <w:spacing w:after="40"/>
+        <w:ind w:left="864"/>
+      </w:pPr>
+      <w:r>
+        <w:rPr>
+          <w:i w:val="0"/>
+          <w:color w:val="555555"/>
+          <w:sz w:val="18"/>
+        </w:rPr>
+        <w:t>NEW-00005  fairly solid  (2 of 6 small changes move it)</w:t>
+      </w:r>
+    </w:p>
+    <w:p>
+      <w:pPr>
+        <w:spacing w:after="40"/>
+        <w:ind w:left="1296"/>
+      </w:pPr>
+      <w:r>
+        <w:rPr>
+          <w:i/>
+          <w:color w:val="555555"/>
+          <w:sz w:val="18"/>
+        </w:rPr>
+        <w:t>if we had a quarter more time left than we thought, it moves from 2 to 4</w:t>
+      </w:r>
+    </w:p>
+    <w:p>
+      <w:pPr>
+        <w:spacing w:after="40"/>
+        <w:ind w:left="1296"/>
+      </w:pPr>
+      <w:r>
+        <w:rPr>
+          <w:i/>
+          <w:color w:val="555555"/>
+          <w:sz w:val="18"/>
+        </w:rPr>
+        <w:t>if this customer pays us £20,000 a month more than recorded, it moves from 2 to 1</w:t>
+      </w:r>
+    </w:p>
+    <w:p>
+      <w:pPr>
+        <w:spacing w:before="240" w:after="60"/>
+      </w:pPr>
+      <w:r>
+        <w:rPr>
+          <w:b/>
+          <w:color w:val="6D28D9"/>
+          <w:sz w:val="23"/>
+        </w:rPr>
+        <w:t>Step 7   Hand them to a person</w:t>
+      </w:r>
+    </w:p>
+    <w:p>
+      <w:pPr>
+        <w:spacing w:after="40"/>
+        <w:ind w:left="432"/>
+      </w:pPr>
+      <w:r>
+        <w:rPr>
+          <w:i w:val="0"/>
+          <w:color w:val="555555"/>
+          <w:sz w:val="18"/>
+        </w:rPr>
+        <w:t>NEW-00001 goes to a person now</w:t>
+      </w:r>
+    </w:p>
+    <w:p>
+      <w:pPr>
+        <w:spacing w:after="40"/>
+        <w:ind w:left="432"/>
+      </w:pPr>
+      <w:r>
+        <w:rPr>
+          <w:i w:val="0"/>
+          <w:color w:val="555555"/>
+          <w:sz w:val="18"/>
+        </w:rPr>
+        <w:t>NEW-00003 goes to a person next</w:t>
+      </w:r>
+    </w:p>
+    <w:p>
+      <w:pPr>
+        <w:spacing w:after="40"/>
+        <w:ind w:left="432"/>
+      </w:pPr>
+      <w:r>
+        <w:rPr>
+          <w:i w:val="0"/>
+          <w:color w:val="555555"/>
+          <w:sz w:val="18"/>
+        </w:rPr>
+        <w:t>NEW-00002 goes to a person next</w:t>
+      </w:r>
+    </w:p>
+    <w:p>
+      <w:pPr>
+        <w:spacing w:after="40"/>
+        <w:ind w:left="432"/>
+      </w:pPr>
+      <w:r>
+        <w:rPr>
+          <w:i w:val="0"/>
+          <w:color w:val="555555"/>
+          <w:sz w:val="18"/>
+        </w:rPr>
+        <w:t>NEW-00004 goes to a person queued   (the numbers were not settled about this one)</w:t>
       </w:r>
     </w:p>
     <w:p>

</xml_diff>

<commit_message>
Track tokens and latency for every model call, with tests
</commit_message>
<xml_diff>
--- a/data/how_the_agent_thinks.docx
+++ b/data/how_the_agent_thinks.docx
@@ -24580,6 +24580,1778 @@
           <w:sz w:val="18"/>
         </w:rPr>
         <w:t>NEW-00005 goes to a person queued</w:t>
+      </w:r>
+    </w:p>
+    <w:p/>
+    <w:p>
+      <w:pPr>
+        <w:spacing w:after="200"/>
+      </w:pPr>
+      <w:r>
+        <w:rPr>
+          <w:color w:val="CCCCCC"/>
+        </w:rPr>
+        <w:t>______________________________________________________________________________</w:t>
+      </w:r>
+    </w:p>
+    <w:p>
+      <w:r>
+        <w:rPr>
+          <w:b/>
+          <w:color w:val="4C1D95"/>
+          <w:sz w:val="30"/>
+        </w:rPr>
+        <w:t>Run on 07 October 2026 at 20:40:07</w:t>
+      </w:r>
+    </w:p>
+    <w:p>
+      <w:pPr>
+        <w:spacing w:after="40"/>
+        <w:ind w:left="0"/>
+      </w:pPr>
+      <w:r>
+        <w:rPr>
+          <w:i/>
+          <w:color w:val="555555"/>
+          <w:sz w:val="18"/>
+        </w:rPr>
+        <w:t>Recorded as DEC-20261007-204007</w:t>
+      </w:r>
+    </w:p>
+    <w:p>
+      <w:pPr>
+        <w:spacing w:before="240" w:after="60"/>
+      </w:pPr>
+      <w:r>
+        <w:rPr>
+          <w:b/>
+          <w:color w:val="6D28D9"/>
+          <w:sz w:val="23"/>
+        </w:rPr>
+        <w:t>Step 1   Pick up the waiting complaints</w:t>
+      </w:r>
+    </w:p>
+    <w:p>
+      <w:pPr>
+        <w:spacing w:after="40"/>
+        <w:ind w:left="0"/>
+      </w:pPr>
+      <w:r>
+        <w:rPr>
+          <w:i w:val="0"/>
+          <w:color w:val="111111"/>
+          <w:sz w:val="20"/>
+        </w:rPr>
+        <w:t>6 complaints were waiting.</w:t>
+      </w:r>
+    </w:p>
+    <w:p>
+      <w:pPr>
+        <w:spacing w:after="40"/>
+        <w:ind w:left="432"/>
+      </w:pPr>
+      <w:r>
+        <w:rPr>
+          <w:i w:val="0"/>
+          <w:color w:val="555555"/>
+          <w:sz w:val="18"/>
+        </w:rPr>
+        <w:t>TICK-00707   The platform is very slow</w:t>
+      </w:r>
+    </w:p>
+    <w:p>
+      <w:pPr>
+        <w:spacing w:after="40"/>
+        <w:ind w:left="432"/>
+      </w:pPr>
+      <w:r>
+        <w:rPr>
+          <w:i w:val="0"/>
+          <w:color w:val="555555"/>
+          <w:sz w:val="18"/>
+        </w:rPr>
+        <w:t>TICK-00171   Deleted records we did not delete</w:t>
+      </w:r>
+    </w:p>
+    <w:p>
+      <w:pPr>
+        <w:spacing w:after="40"/>
+        <w:ind w:left="432"/>
+      </w:pPr>
+      <w:r>
+        <w:rPr>
+          <w:i w:val="0"/>
+          <w:color w:val="555555"/>
+          <w:sz w:val="18"/>
+        </w:rPr>
+        <w:t>TICK-00771   Possible breach</w:t>
+      </w:r>
+    </w:p>
+    <w:p>
+      <w:pPr>
+        <w:spacing w:after="40"/>
+        <w:ind w:left="432"/>
+      </w:pPr>
+      <w:r>
+        <w:rPr>
+          <w:i w:val="0"/>
+          <w:color w:val="555555"/>
+          <w:sz w:val="18"/>
+        </w:rPr>
+        <w:t>TICK-00266   Request for bulk actions</w:t>
+      </w:r>
+    </w:p>
+    <w:p>
+      <w:pPr>
+        <w:spacing w:after="40"/>
+        <w:ind w:left="432"/>
+      </w:pPr>
+      <w:r>
+        <w:rPr>
+          <w:i w:val="0"/>
+          <w:color w:val="555555"/>
+          <w:sz w:val="18"/>
+        </w:rPr>
+        <w:t>TICK-00982   Cannot download report</w:t>
+      </w:r>
+    </w:p>
+    <w:p>
+      <w:pPr>
+        <w:spacing w:after="40"/>
+        <w:ind w:left="432"/>
+      </w:pPr>
+      <w:r>
+        <w:rPr>
+          <w:i w:val="0"/>
+          <w:color w:val="555555"/>
+          <w:sz w:val="18"/>
+        </w:rPr>
+        <w:t>TICK-00135   Password reset needed</w:t>
+      </w:r>
+    </w:p>
+    <w:p>
+      <w:pPr>
+        <w:spacing w:before="240" w:after="60"/>
+      </w:pPr>
+      <w:r>
+        <w:rPr>
+          <w:b/>
+          <w:color w:val="6D28D9"/>
+          <w:sz w:val="23"/>
+        </w:rPr>
+        <w:t>Step 2   Look up the three separate systems</w:t>
+      </w:r>
+    </w:p>
+    <w:p>
+      <w:pPr>
+        <w:spacing w:after="40"/>
+        <w:ind w:left="0"/>
+      </w:pPr>
+      <w:r>
+        <w:rPr>
+          <w:i w:val="0"/>
+          <w:color w:val="111111"/>
+          <w:sz w:val="20"/>
+        </w:rPr>
+        <w:t>Each system knows a different part of the story, and none of them can see what the others see.</w:t>
+      </w:r>
+    </w:p>
+    <w:p>
+      <w:pPr>
+        <w:spacing w:after="40"/>
+        <w:ind w:left="432"/>
+      </w:pPr>
+      <w:r>
+        <w:rPr>
+          <w:i w:val="0"/>
+          <w:color w:val="555555"/>
+          <w:sz w:val="18"/>
+        </w:rPr>
+        <w:t>TICK-00707</w:t>
+      </w:r>
+    </w:p>
+    <w:p>
+      <w:pPr>
+        <w:spacing w:after="40"/>
+        <w:ind w:left="864"/>
+      </w:pPr>
+      <w:r>
+        <w:rPr>
+          <w:i w:val="0"/>
+          <w:color w:val="555555"/>
+          <w:sz w:val="18"/>
+        </w:rPr>
+        <w:t>Customer records say: Enterprise plan, pays £39,127 a month, has asked 2 times</w:t>
+      </w:r>
+    </w:p>
+    <w:p>
+      <w:pPr>
+        <w:spacing w:after="40"/>
+        <w:ind w:left="864"/>
+      </w:pPr>
+      <w:r>
+        <w:rPr>
+          <w:i w:val="0"/>
+          <w:color w:val="555555"/>
+          <w:sz w:val="18"/>
+        </w:rPr>
+        <w:t>Monitoring says: Low, 3 people affected, work blocked: no</w:t>
+      </w:r>
+    </w:p>
+    <w:p>
+      <w:pPr>
+        <w:spacing w:after="40"/>
+        <w:ind w:left="864"/>
+      </w:pPr>
+      <w:r>
+        <w:rPr>
+          <w:i w:val="0"/>
+          <w:color w:val="555555"/>
+          <w:sz w:val="18"/>
+        </w:rPr>
+        <w:t>The promise clock says: 2.0 hours promised, 1.1 left</w:t>
+      </w:r>
+    </w:p>
+    <w:p>
+      <w:pPr>
+        <w:spacing w:after="40"/>
+        <w:ind w:left="864"/>
+      </w:pPr>
+      <w:r>
+        <w:rPr>
+          <w:i w:val="0"/>
+          <w:color w:val="555555"/>
+          <w:sz w:val="18"/>
+        </w:rPr>
+        <w:t>The customer themselves said: Low</w:t>
+      </w:r>
+    </w:p>
+    <w:p>
+      <w:pPr>
+        <w:spacing w:after="40"/>
+        <w:ind w:left="432"/>
+      </w:pPr>
+      <w:r>
+        <w:rPr>
+          <w:i w:val="0"/>
+          <w:color w:val="555555"/>
+          <w:sz w:val="18"/>
+        </w:rPr>
+        <w:t>TICK-00171</w:t>
+      </w:r>
+    </w:p>
+    <w:p>
+      <w:pPr>
+        <w:spacing w:after="40"/>
+        <w:ind w:left="864"/>
+      </w:pPr>
+      <w:r>
+        <w:rPr>
+          <w:i w:val="0"/>
+          <w:color w:val="555555"/>
+          <w:sz w:val="18"/>
+        </w:rPr>
+        <w:t>Customer records say: Free plan, pays £0 a month, has asked 1 time</w:t>
+      </w:r>
+    </w:p>
+    <w:p>
+      <w:pPr>
+        <w:spacing w:after="40"/>
+        <w:ind w:left="864"/>
+      </w:pPr>
+      <w:r>
+        <w:rPr>
+          <w:i w:val="0"/>
+          <w:color w:val="555555"/>
+          <w:sz w:val="18"/>
+        </w:rPr>
+        <w:t>Monitoring says: Critical, 4940 people affected, work blocked: yes</w:t>
+      </w:r>
+    </w:p>
+    <w:p>
+      <w:pPr>
+        <w:spacing w:after="40"/>
+        <w:ind w:left="864"/>
+      </w:pPr>
+      <w:r>
+        <w:rPr>
+          <w:i w:val="0"/>
+          <w:color w:val="555555"/>
+          <w:sz w:val="18"/>
+        </w:rPr>
+        <w:t>The promise clock says: 72.0 hours promised, 29.6 left</w:t>
+      </w:r>
+    </w:p>
+    <w:p>
+      <w:pPr>
+        <w:spacing w:after="40"/>
+        <w:ind w:left="864"/>
+      </w:pPr>
+      <w:r>
+        <w:rPr>
+          <w:i w:val="0"/>
+          <w:color w:val="555555"/>
+          <w:sz w:val="18"/>
+        </w:rPr>
+        <w:t>The customer themselves said: Critical</w:t>
+      </w:r>
+    </w:p>
+    <w:p>
+      <w:pPr>
+        <w:spacing w:after="40"/>
+        <w:ind w:left="432"/>
+      </w:pPr>
+      <w:r>
+        <w:rPr>
+          <w:i w:val="0"/>
+          <w:color w:val="555555"/>
+          <w:sz w:val="18"/>
+        </w:rPr>
+        <w:t>TICK-00771</w:t>
+      </w:r>
+    </w:p>
+    <w:p>
+      <w:pPr>
+        <w:spacing w:after="40"/>
+        <w:ind w:left="864"/>
+      </w:pPr>
+      <w:r>
+        <w:rPr>
+          <w:i w:val="0"/>
+          <w:color w:val="555555"/>
+          <w:sz w:val="18"/>
+        </w:rPr>
+        <w:t>Customer records say: Basic plan, pays £55 a month, has asked 7 times</w:t>
+      </w:r>
+    </w:p>
+    <w:p>
+      <w:pPr>
+        <w:spacing w:after="40"/>
+        <w:ind w:left="864"/>
+      </w:pPr>
+      <w:r>
+        <w:rPr>
+          <w:i w:val="0"/>
+          <w:color w:val="555555"/>
+          <w:sz w:val="18"/>
+        </w:rPr>
+        <w:t>Monitoring says: Low, 1 person affected, work blocked: no</w:t>
+      </w:r>
+    </w:p>
+    <w:p>
+      <w:pPr>
+        <w:spacing w:after="40"/>
+        <w:ind w:left="864"/>
+      </w:pPr>
+      <w:r>
+        <w:rPr>
+          <w:i w:val="0"/>
+          <w:color w:val="555555"/>
+          <w:sz w:val="18"/>
+        </w:rPr>
+        <w:t>The promise clock says: 24.0 hours promised, 15.4 left</w:t>
+      </w:r>
+    </w:p>
+    <w:p>
+      <w:pPr>
+        <w:spacing w:after="40"/>
+        <w:ind w:left="864"/>
+      </w:pPr>
+      <w:r>
+        <w:rPr>
+          <w:i w:val="0"/>
+          <w:color w:val="555555"/>
+          <w:sz w:val="18"/>
+        </w:rPr>
+        <w:t>The customer themselves said: High</w:t>
+      </w:r>
+    </w:p>
+    <w:p>
+      <w:pPr>
+        <w:spacing w:after="40"/>
+        <w:ind w:left="432"/>
+      </w:pPr>
+      <w:r>
+        <w:rPr>
+          <w:i w:val="0"/>
+          <w:color w:val="555555"/>
+          <w:sz w:val="18"/>
+        </w:rPr>
+        <w:t>TICK-00266</w:t>
+      </w:r>
+    </w:p>
+    <w:p>
+      <w:pPr>
+        <w:spacing w:after="40"/>
+        <w:ind w:left="864"/>
+      </w:pPr>
+      <w:r>
+        <w:rPr>
+          <w:i w:val="0"/>
+          <w:color w:val="555555"/>
+          <w:sz w:val="18"/>
+        </w:rPr>
+        <w:t>Customer records say: Enterprise plan, pays £29,044 a month, has asked 4 times</w:t>
+      </w:r>
+    </w:p>
+    <w:p>
+      <w:pPr>
+        <w:spacing w:after="40"/>
+        <w:ind w:left="864"/>
+      </w:pPr>
+      <w:r>
+        <w:rPr>
+          <w:i w:val="0"/>
+          <w:color w:val="555555"/>
+          <w:sz w:val="18"/>
+        </w:rPr>
+        <w:t>Monitoring says: Low, 1 person affected, work blocked: no</w:t>
+      </w:r>
+    </w:p>
+    <w:p>
+      <w:pPr>
+        <w:spacing w:after="40"/>
+        <w:ind w:left="864"/>
+      </w:pPr>
+      <w:r>
+        <w:rPr>
+          <w:i w:val="0"/>
+          <w:color w:val="555555"/>
+          <w:sz w:val="18"/>
+        </w:rPr>
+        <w:t>The promise clock says: 2.0 hours promised, 0.3 left</w:t>
+      </w:r>
+    </w:p>
+    <w:p>
+      <w:pPr>
+        <w:spacing w:after="40"/>
+        <w:ind w:left="864"/>
+      </w:pPr>
+      <w:r>
+        <w:rPr>
+          <w:i w:val="0"/>
+          <w:color w:val="555555"/>
+          <w:sz w:val="18"/>
+        </w:rPr>
+        <w:t>The customer themselves said: High</w:t>
+      </w:r>
+    </w:p>
+    <w:p>
+      <w:pPr>
+        <w:spacing w:after="40"/>
+        <w:ind w:left="432"/>
+      </w:pPr>
+      <w:r>
+        <w:rPr>
+          <w:i w:val="0"/>
+          <w:color w:val="555555"/>
+          <w:sz w:val="18"/>
+        </w:rPr>
+        <w:t>TICK-00982</w:t>
+      </w:r>
+    </w:p>
+    <w:p>
+      <w:pPr>
+        <w:spacing w:after="40"/>
+        <w:ind w:left="864"/>
+      </w:pPr>
+      <w:r>
+        <w:rPr>
+          <w:i w:val="0"/>
+          <w:color w:val="555555"/>
+          <w:sz w:val="18"/>
+        </w:rPr>
+        <w:t>Customer records say: Basic plan, pays £106 a month, has asked 11 times</w:t>
+      </w:r>
+    </w:p>
+    <w:p>
+      <w:pPr>
+        <w:spacing w:after="40"/>
+        <w:ind w:left="864"/>
+      </w:pPr>
+      <w:r>
+        <w:rPr>
+          <w:i w:val="0"/>
+          <w:color w:val="555555"/>
+          <w:sz w:val="18"/>
+        </w:rPr>
+        <w:t>Monitoring says: Medium, 35 people affected, work blocked: no</w:t>
+      </w:r>
+    </w:p>
+    <w:p>
+      <w:pPr>
+        <w:spacing w:after="40"/>
+        <w:ind w:left="864"/>
+      </w:pPr>
+      <w:r>
+        <w:rPr>
+          <w:i w:val="0"/>
+          <w:color w:val="555555"/>
+          <w:sz w:val="18"/>
+        </w:rPr>
+        <w:t>The promise clock says: 24.0 hours promised, -49.8 left, already late</w:t>
+      </w:r>
+    </w:p>
+    <w:p>
+      <w:pPr>
+        <w:spacing w:after="40"/>
+        <w:ind w:left="864"/>
+      </w:pPr>
+      <w:r>
+        <w:rPr>
+          <w:i w:val="0"/>
+          <w:color w:val="555555"/>
+          <w:sz w:val="18"/>
+        </w:rPr>
+        <w:t>The customer themselves said: Medium</w:t>
+      </w:r>
+    </w:p>
+    <w:p>
+      <w:pPr>
+        <w:spacing w:after="40"/>
+        <w:ind w:left="432"/>
+      </w:pPr>
+      <w:r>
+        <w:rPr>
+          <w:i w:val="0"/>
+          <w:color w:val="555555"/>
+          <w:sz w:val="18"/>
+        </w:rPr>
+        <w:t>TICK-00135</w:t>
+      </w:r>
+    </w:p>
+    <w:p>
+      <w:pPr>
+        <w:spacing w:after="40"/>
+        <w:ind w:left="864"/>
+      </w:pPr>
+      <w:r>
+        <w:rPr>
+          <w:i w:val="0"/>
+          <w:color w:val="555555"/>
+          <w:sz w:val="18"/>
+        </w:rPr>
+        <w:t>Customer records say: Basic plan, pays £41 a month, has asked 1 time</w:t>
+      </w:r>
+    </w:p>
+    <w:p>
+      <w:pPr>
+        <w:spacing w:after="40"/>
+        <w:ind w:left="864"/>
+      </w:pPr>
+      <w:r>
+        <w:rPr>
+          <w:i w:val="0"/>
+          <w:color w:val="555555"/>
+          <w:sz w:val="18"/>
+        </w:rPr>
+        <w:t>Monitoring says: Low, 1 person affected, work blocked: no</w:t>
+      </w:r>
+    </w:p>
+    <w:p>
+      <w:pPr>
+        <w:spacing w:after="40"/>
+        <w:ind w:left="864"/>
+      </w:pPr>
+      <w:r>
+        <w:rPr>
+          <w:i w:val="0"/>
+          <w:color w:val="555555"/>
+          <w:sz w:val="18"/>
+        </w:rPr>
+        <w:t>The promise clock says: 24.0 hours promised, 19.3 left</w:t>
+      </w:r>
+    </w:p>
+    <w:p>
+      <w:pPr>
+        <w:spacing w:after="40"/>
+        <w:ind w:left="864"/>
+      </w:pPr>
+      <w:r>
+        <w:rPr>
+          <w:i w:val="0"/>
+          <w:color w:val="555555"/>
+          <w:sz w:val="18"/>
+        </w:rPr>
+        <w:t>The customer themselves said: Critical</w:t>
+      </w:r>
+    </w:p>
+    <w:p>
+      <w:pPr>
+        <w:spacing w:before="240" w:after="60"/>
+      </w:pPr>
+      <w:r>
+        <w:rPr>
+          <w:b/>
+          <w:color w:val="6D28D9"/>
+          <w:sz w:val="23"/>
+        </w:rPr>
+        <w:t>Step 3   Rank them four different ways</w:t>
+      </w:r>
+    </w:p>
+    <w:p>
+      <w:pPr>
+        <w:spacing w:after="40"/>
+        <w:ind w:left="0"/>
+      </w:pPr>
+      <w:r>
+        <w:rPr>
+          <w:i w:val="0"/>
+          <w:color w:val="111111"/>
+          <w:sz w:val="20"/>
+        </w:rPr>
+        <w:t>Each way is reasonable on its own, and each one is wrong on its own. They are evidence for the agent to weigh, not instructions to follow.</w:t>
+      </w:r>
+    </w:p>
+    <w:p>
+      <w:pPr>
+        <w:spacing w:after="40"/>
+        <w:ind w:left="432"/>
+      </w:pPr>
+      <w:r>
+        <w:rPr>
+          <w:i w:val="0"/>
+          <w:color w:val="555555"/>
+          <w:sz w:val="18"/>
+        </w:rPr>
+        <w:t>By money:  1. TICK-00707  2. TICK-00266  3. TICK-00982  4. TICK-00771  5. TICK-00135  6. TICK-00171</w:t>
+      </w:r>
+    </w:p>
+    <w:p>
+      <w:pPr>
+        <w:spacing w:after="40"/>
+        <w:ind w:left="432"/>
+      </w:pPr>
+      <w:r>
+        <w:rPr>
+          <w:i w:val="0"/>
+          <w:color w:val="555555"/>
+          <w:sz w:val="18"/>
+        </w:rPr>
+        <w:t>By damage:  1. TICK-00171  2. TICK-00982  3. TICK-00707  4. TICK-00771  5. TICK-00266  6. TICK-00135</w:t>
+      </w:r>
+    </w:p>
+    <w:p>
+      <w:pPr>
+        <w:spacing w:after="40"/>
+        <w:ind w:left="432"/>
+      </w:pPr>
+      <w:r>
+        <w:rPr>
+          <w:i w:val="0"/>
+          <w:color w:val="555555"/>
+          <w:sz w:val="18"/>
+        </w:rPr>
+        <w:t>By deadline:  1. TICK-00982  2. TICK-00266  3. TICK-00171  4. TICK-00707  5. TICK-00771  6. TICK-00135</w:t>
+      </w:r>
+    </w:p>
+    <w:p>
+      <w:pPr>
+        <w:spacing w:after="40"/>
+        <w:ind w:left="432"/>
+      </w:pPr>
+      <w:r>
+        <w:rPr>
+          <w:i w:val="0"/>
+          <w:color w:val="555555"/>
+          <w:sz w:val="18"/>
+        </w:rPr>
+        <w:t>By fairness:  1. TICK-00982  2. TICK-00771  3. TICK-00266  4. TICK-00171  5. TICK-00135  6. TICK-00707</w:t>
+      </w:r>
+    </w:p>
+    <w:p>
+      <w:pPr>
+        <w:spacing w:after="40"/>
+        <w:ind w:left="0"/>
+      </w:pPr>
+      <w:r>
+        <w:rPr>
+          <w:i w:val="0"/>
+          <w:color w:val="111111"/>
+          <w:sz w:val="20"/>
+        </w:rPr>
+      </w:r>
+    </w:p>
+    <w:p>
+      <w:pPr>
+        <w:spacing w:after="40"/>
+        <w:ind w:left="432"/>
+      </w:pPr>
+      <w:r>
+        <w:rPr>
+          <w:i w:val="0"/>
+          <w:color w:val="111111"/>
+          <w:sz w:val="20"/>
+        </w:rPr>
+        <w:t>Where the four disagreed most:</w:t>
+      </w:r>
+    </w:p>
+    <w:p>
+      <w:pPr>
+        <w:spacing w:after="40"/>
+        <w:ind w:left="864"/>
+      </w:pPr>
+      <w:r>
+        <w:rPr>
+          <w:i w:val="0"/>
+          <w:color w:val="555555"/>
+          <w:sz w:val="18"/>
+        </w:rPr>
+        <w:t>TICK-00707 was placed as high as 1 and as low as 6. This is where judgement was needed.</w:t>
+      </w:r>
+    </w:p>
+    <w:p>
+      <w:pPr>
+        <w:spacing w:after="40"/>
+        <w:ind w:left="864"/>
+      </w:pPr>
+      <w:r>
+        <w:rPr>
+          <w:i w:val="0"/>
+          <w:color w:val="555555"/>
+          <w:sz w:val="18"/>
+        </w:rPr>
+        <w:t>TICK-00171 was placed as high as 1 and as low as 6. This is where judgement was needed.</w:t>
+      </w:r>
+    </w:p>
+    <w:p>
+      <w:pPr>
+        <w:spacing w:after="40"/>
+        <w:ind w:left="864"/>
+      </w:pPr>
+      <w:r>
+        <w:rPr>
+          <w:i w:val="0"/>
+          <w:color w:val="555555"/>
+          <w:sz w:val="18"/>
+        </w:rPr>
+        <w:t>TICK-00771 was placed as high as 2 and as low as 5. This is where judgement was needed.</w:t>
+      </w:r>
+    </w:p>
+    <w:p>
+      <w:pPr>
+        <w:spacing w:after="40"/>
+        <w:ind w:left="864"/>
+      </w:pPr>
+      <w:r>
+        <w:rPr>
+          <w:i w:val="0"/>
+          <w:color w:val="555555"/>
+          <w:sz w:val="18"/>
+        </w:rPr>
+        <w:t>TICK-00266 was placed as high as 2 and as low as 5. This is where judgement was needed.</w:t>
+      </w:r>
+    </w:p>
+    <w:p>
+      <w:pPr>
+        <w:spacing w:before="240" w:after="60"/>
+      </w:pPr>
+      <w:r>
+        <w:rPr>
+          <w:b/>
+          <w:color w:val="6D28D9"/>
+          <w:sz w:val="23"/>
+        </w:rPr>
+        <w:t>Step 4   Read what the customer actually wrote</w:t>
+      </w:r>
+    </w:p>
+    <w:p>
+      <w:pPr>
+        <w:spacing w:after="40"/>
+        <w:ind w:left="0"/>
+      </w:pPr>
+      <w:r>
+        <w:rPr>
+          <w:i w:val="0"/>
+          <w:color w:val="111111"/>
+          <w:sz w:val="20"/>
+        </w:rPr>
+        <w:t>The four ways above only look at numbers, so they cannot tell a password reset apart from a break-in. Both look like one person with nothing failing. The words are the difference.</w:t>
+      </w:r>
+    </w:p>
+    <w:p>
+      <w:pPr>
+        <w:spacing w:after="40"/>
+        <w:ind w:left="432"/>
+      </w:pPr>
+      <w:r>
+        <w:rPr>
+          <w:i w:val="0"/>
+          <w:color w:val="555555"/>
+          <w:sz w:val="18"/>
+        </w:rPr>
+        <w:t>TICK-00707: “Hello, Pages take around thirty seconds to load. No rush, whenever you get a chance.”</w:t>
+      </w:r>
+    </w:p>
+    <w:p>
+      <w:pPr>
+        <w:spacing w:after="40"/>
+        <w:ind w:left="432"/>
+      </w:pPr>
+      <w:r>
+        <w:rPr>
+          <w:i w:val="0"/>
+          <w:color w:val="555555"/>
+          <w:sz w:val="18"/>
+        </w:rPr>
+        <w:t>TICK-00171: “Hi there, A folder of client files is gone and nobody on our side removed it. Many thanks.”</w:t>
+      </w:r>
+    </w:p>
+    <w:p>
+      <w:pPr>
+        <w:spacing w:after="40"/>
+        <w:ind w:left="432"/>
+      </w:pPr>
+      <w:r>
+        <w:rPr>
+          <w:i w:val="0"/>
+          <w:color w:val="555555"/>
+          <w:sz w:val="18"/>
+        </w:rPr>
+        <w:t>TICK-00771: “Hi, Someone has changed our admin email address and it was not us. Please could someone look at this.”</w:t>
+      </w:r>
+    </w:p>
+    <w:p>
+      <w:pPr>
+        <w:spacing w:after="40"/>
+        <w:ind w:left="432"/>
+      </w:pPr>
+      <w:r>
+        <w:rPr>
+          <w:i w:val="0"/>
+          <w:color w:val="555555"/>
+          <w:sz w:val="18"/>
+        </w:rPr>
+        <w:t>TICK-00266: “This is now the third time I am writing. Being able to select several rows at once would save us a lot of time. We expect a reply today.”</w:t>
+      </w:r>
+    </w:p>
+    <w:p>
+      <w:pPr>
+        <w:spacing w:after="40"/>
+        <w:ind w:left="432"/>
+      </w:pPr>
+      <w:r>
+        <w:rPr>
+          <w:i w:val="0"/>
+          <w:color w:val="555555"/>
+          <w:sz w:val="18"/>
+        </w:rPr>
+        <w:t>TICK-00982: “Hi, The export button spins for a while and then nothing happens. This is holding us up.”</w:t>
+      </w:r>
+    </w:p>
+    <w:p>
+      <w:pPr>
+        <w:spacing w:after="40"/>
+        <w:ind w:left="432"/>
+      </w:pPr>
+      <w:r>
+        <w:rPr>
+          <w:i w:val="0"/>
+          <w:color w:val="555555"/>
+          <w:sz w:val="18"/>
+        </w:rPr>
+        <w:t>TICK-00135: “This is now the third time I am writing. The reset link never arrives in my inbox. Please escalate this immediately.”</w:t>
+      </w:r>
+    </w:p>
+    <w:p>
+      <w:pPr>
+        <w:spacing w:before="240" w:after="60"/>
+      </w:pPr>
+      <w:r>
+        <w:rPr>
+          <w:b/>
+          <w:color w:val="6D28D9"/>
+          <w:sz w:val="23"/>
+        </w:rPr>
+        <w:t>Step 5   The AI decides, and says why</w:t>
+      </w:r>
+    </w:p>
+    <w:p>
+      <w:pPr>
+        <w:spacing w:after="40"/>
+        <w:ind w:left="432"/>
+      </w:pPr>
+      <w:r>
+        <w:rPr>
+          <w:i w:val="0"/>
+          <w:color w:val="111111"/>
+          <w:sz w:val="20"/>
+        </w:rPr>
+        <w:t>1. TICK-00171   Deleted records we did not delete</w:t>
+      </w:r>
+    </w:p>
+    <w:p>
+      <w:pPr>
+        <w:spacing w:after="40"/>
+        <w:ind w:left="864"/>
+      </w:pPr>
+      <w:r>
+        <w:rPr>
+          <w:i/>
+          <w:color w:val="555555"/>
+          <w:sz w:val="20"/>
+        </w:rPr>
+        <w:t>Critical data loss affecting thousands and blocking work forces immediate attention despite the customer’s free plan.</w:t>
+      </w:r>
+    </w:p>
+    <w:p>
+      <w:pPr>
+        <w:spacing w:after="40"/>
+        <w:ind w:left="432"/>
+      </w:pPr>
+      <w:r>
+        <w:rPr>
+          <w:i w:val="0"/>
+          <w:color w:val="111111"/>
+          <w:sz w:val="20"/>
+        </w:rPr>
+        <w:t>2. TICK-00771   Possible breach</w:t>
+      </w:r>
+    </w:p>
+    <w:p>
+      <w:pPr>
+        <w:spacing w:after="40"/>
+        <w:ind w:left="864"/>
+      </w:pPr>
+      <w:r>
+        <w:rPr>
+          <w:i/>
+          <w:color w:val="555555"/>
+          <w:sz w:val="20"/>
+        </w:rPr>
+        <w:t>A suspected account takeover must be handled within the top three because monitoring can’t capture its true risk.</w:t>
+      </w:r>
+    </w:p>
+    <w:p>
+      <w:pPr>
+        <w:spacing w:after="40"/>
+        <w:ind w:left="432"/>
+      </w:pPr>
+      <w:r>
+        <w:rPr>
+          <w:i w:val="0"/>
+          <w:color w:val="111111"/>
+          <w:sz w:val="20"/>
+        </w:rPr>
+        <w:t>3. TICK-00982   Cannot download report</w:t>
+      </w:r>
+    </w:p>
+    <w:p>
+      <w:pPr>
+        <w:spacing w:after="40"/>
+        <w:ind w:left="864"/>
+      </w:pPr>
+      <w:r>
+        <w:rPr>
+          <w:i/>
+          <w:color w:val="555555"/>
+          <w:sz w:val="20"/>
+        </w:rPr>
+        <w:t>The export failure is already overdue and impacts dozens, so it jumps ahead of lower‑impact tickets.</w:t>
+      </w:r>
+    </w:p>
+    <w:p>
+      <w:pPr>
+        <w:spacing w:after="40"/>
+        <w:ind w:left="432"/>
+      </w:pPr>
+      <w:r>
+        <w:rPr>
+          <w:i w:val="0"/>
+          <w:color w:val="111111"/>
+          <w:sz w:val="20"/>
+        </w:rPr>
+        <w:t>4. TICK-00266   Request for bulk actions</w:t>
+      </w:r>
+    </w:p>
+    <w:p>
+      <w:pPr>
+        <w:spacing w:after="40"/>
+        <w:ind w:left="864"/>
+      </w:pPr>
+      <w:r>
+        <w:rPr>
+          <w:i/>
+          <w:color w:val="555555"/>
+          <w:sz w:val="20"/>
+        </w:rPr>
+        <w:t>An enterprise client’s near‑deadline bulk‑action request and high revenue make it urgent.</w:t>
+      </w:r>
+    </w:p>
+    <w:p>
+      <w:pPr>
+        <w:spacing w:after="40"/>
+        <w:ind w:left="432"/>
+      </w:pPr>
+      <w:r>
+        <w:rPr>
+          <w:i w:val="0"/>
+          <w:color w:val="111111"/>
+          <w:sz w:val="20"/>
+        </w:rPr>
+        <w:t>5. TICK-00707   The platform is very slow</w:t>
+      </w:r>
+    </w:p>
+    <w:p>
+      <w:pPr>
+        <w:spacing w:after="40"/>
+        <w:ind w:left="864"/>
+      </w:pPr>
+      <w:r>
+        <w:rPr>
+          <w:i/>
+          <w:color w:val="555555"/>
+          <w:sz w:val="20"/>
+        </w:rPr>
+        <w:t>High‑paying enterprise experiencing slow pages under heavy load deserves prompt handling after the more critical issues.</w:t>
+      </w:r>
+    </w:p>
+    <w:p>
+      <w:pPr>
+        <w:spacing w:after="40"/>
+        <w:ind w:left="432"/>
+      </w:pPr>
+      <w:r>
+        <w:rPr>
+          <w:i w:val="0"/>
+          <w:color w:val="111111"/>
+          <w:sz w:val="20"/>
+        </w:rPr>
+        <w:t>6. TICK-00135   Password reset needed</w:t>
+      </w:r>
+    </w:p>
+    <w:p>
+      <w:pPr>
+        <w:spacing w:after="40"/>
+        <w:ind w:left="864"/>
+      </w:pPr>
+      <w:r>
+        <w:rPr>
+          <w:i/>
+          <w:color w:val="555555"/>
+          <w:sz w:val="20"/>
+        </w:rPr>
+        <w:t>A single‑user password reset with low severity and ample time left can wait.</w:t>
+      </w:r>
+    </w:p>
+    <w:p>
+      <w:pPr>
+        <w:spacing w:after="40"/>
+        <w:ind w:left="0"/>
+      </w:pPr>
+      <w:r>
+        <w:rPr>
+          <w:i w:val="0"/>
+          <w:color w:val="111111"/>
+          <w:sz w:val="20"/>
+        </w:rPr>
+      </w:r>
+    </w:p>
+    <w:p>
+      <w:pPr>
+        <w:spacing w:after="40"/>
+        <w:ind w:left="432"/>
+      </w:pPr>
+      <w:r>
+        <w:rPr>
+          <w:i w:val="0"/>
+          <w:color w:val="111111"/>
+          <w:sz w:val="20"/>
+        </w:rPr>
+        <w:t>The trade-off it made:</w:t>
+      </w:r>
+    </w:p>
+    <w:p>
+      <w:pPr>
+        <w:spacing w:after="40"/>
+        <w:ind w:left="864"/>
+      </w:pPr>
+      <w:r>
+        <w:rPr>
+          <w:i/>
+          <w:color w:val="555555"/>
+          <w:sz w:val="20"/>
+        </w:rPr>
+        <w:t>We favoured damage, security and deadline urgency over pure revenue, sacrificing a strict money‑first ordering. This may delay a quick win for a big‑paying client, risking slight dissatisfaction.</w:t>
+      </w:r>
+    </w:p>
+    <w:p>
+      <w:pPr>
+        <w:spacing w:after="40"/>
+        <w:ind w:left="0"/>
+      </w:pPr>
+      <w:r>
+        <w:rPr>
+          <w:i w:val="0"/>
+          <w:color w:val="111111"/>
+          <w:sz w:val="20"/>
+        </w:rPr>
+      </w:r>
+    </w:p>
+    <w:p>
+      <w:pPr>
+        <w:spacing w:after="40"/>
+        <w:ind w:left="432"/>
+      </w:pPr>
+      <w:r>
+        <w:rPr>
+          <w:i w:val="0"/>
+          <w:color w:val="111111"/>
+          <w:sz w:val="20"/>
+        </w:rPr>
+        <w:t>The closest call:</w:t>
+      </w:r>
+    </w:p>
+    <w:p>
+      <w:pPr>
+        <w:spacing w:after="40"/>
+        <w:ind w:left="864"/>
+      </w:pPr>
+      <w:r>
+        <w:rPr>
+          <w:i/>
+          <w:color w:val="555555"/>
+          <w:sz w:val="20"/>
+        </w:rPr>
+        <w:t>Choosing TICK-00982 over TICK-00266 was close; the overdue deadline pushed the export failure ahead of a high‑paying enterprise request, but one could argue revenue should dominate.</w:t>
+      </w:r>
+    </w:p>
+    <w:p>
+      <w:pPr>
+        <w:spacing w:after="40"/>
+        <w:ind w:left="0"/>
+      </w:pPr>
+      <w:r>
+        <w:rPr>
+          <w:i w:val="0"/>
+          <w:color w:val="111111"/>
+          <w:sz w:val="20"/>
+        </w:rPr>
+      </w:r>
+    </w:p>
+    <w:p>
+      <w:pPr>
+        <w:spacing w:after="40"/>
+        <w:ind w:left="432"/>
+      </w:pPr>
+      <w:r>
+        <w:rPr>
+          <w:i w:val="0"/>
+          <w:color w:val="111111"/>
+          <w:sz w:val="20"/>
+        </w:rPr>
+        <w:t>How it ranked the four ways of deciding:</w:t>
+      </w:r>
+    </w:p>
+    <w:p>
+      <w:pPr>
+        <w:spacing w:after="40"/>
+        <w:ind w:left="864"/>
+      </w:pPr>
+      <w:r>
+        <w:rPr>
+          <w:i w:val="0"/>
+          <w:color w:val="111111"/>
+          <w:sz w:val="20"/>
+        </w:rPr>
+        <w:t>1. damage</w:t>
+      </w:r>
+    </w:p>
+    <w:p>
+      <w:pPr>
+        <w:spacing w:after="40"/>
+        <w:ind w:left="1296"/>
+      </w:pPr>
+      <w:r>
+        <w:rPr>
+          <w:i/>
+          <w:color w:val="555555"/>
+          <w:sz w:val="20"/>
+        </w:rPr>
+        <w:t>why here: Actual user impact and work blockage directly reflect business harm and were decisive for the top tickets.</w:t>
+      </w:r>
+    </w:p>
+    <w:p>
+      <w:pPr>
+        <w:spacing w:after="40"/>
+        <w:ind w:left="1296"/>
+      </w:pPr>
+      <w:r>
+        <w:rPr>
+          <w:i/>
+          <w:color w:val="555555"/>
+          <w:sz w:val="20"/>
+        </w:rPr>
+        <w:t>gets wrong: It can de‑prioritise high‑paying customers whose issues are less severe, risking revenue dissatisfaction.</w:t>
+      </w:r>
+    </w:p>
+    <w:p>
+      <w:pPr>
+        <w:spacing w:after="40"/>
+        <w:ind w:left="864"/>
+      </w:pPr>
+      <w:r>
+        <w:rPr>
+          <w:i w:val="0"/>
+          <w:color w:val="111111"/>
+          <w:sz w:val="20"/>
+        </w:rPr>
+        <w:t>2. deadline</w:t>
+      </w:r>
+    </w:p>
+    <w:p>
+      <w:pPr>
+        <w:spacing w:after="40"/>
+        <w:ind w:left="1296"/>
+      </w:pPr>
+      <w:r>
+        <w:rPr>
+          <w:i/>
+          <w:color w:val="555555"/>
+          <w:sz w:val="20"/>
+        </w:rPr>
+        <w:t>why here: Overdue tickets create SLA breaches and legal risk, so timeliness is the next most important factor.</w:t>
+      </w:r>
+    </w:p>
+    <w:p>
+      <w:pPr>
+        <w:spacing w:after="40"/>
+        <w:ind w:left="1296"/>
+      </w:pPr>
+      <w:r>
+        <w:rPr>
+          <w:i/>
+          <w:color w:val="555555"/>
+          <w:sz w:val="20"/>
+        </w:rPr>
+        <w:t>gets wrong: It may elevate low‑impact but late tickets above more critical but on‑time problems.</w:t>
+      </w:r>
+    </w:p>
+    <w:p>
+      <w:pPr>
+        <w:spacing w:after="40"/>
+        <w:ind w:left="864"/>
+      </w:pPr>
+      <w:r>
+        <w:rPr>
+          <w:i w:val="0"/>
+          <w:color w:val="111111"/>
+          <w:sz w:val="20"/>
+        </w:rPr>
+        <w:t>3. money</w:t>
+      </w:r>
+    </w:p>
+    <w:p>
+      <w:pPr>
+        <w:spacing w:after="40"/>
+        <w:ind w:left="1296"/>
+      </w:pPr>
+      <w:r>
+        <w:rPr>
+          <w:i/>
+          <w:color w:val="555555"/>
+          <w:sz w:val="20"/>
+        </w:rPr>
+        <w:t>why here: Revenue is important for business health, but it should not override clear damage or deadline breaches.</w:t>
+      </w:r>
+    </w:p>
+    <w:p>
+      <w:pPr>
+        <w:spacing w:after="40"/>
+        <w:ind w:left="1296"/>
+      </w:pPr>
+      <w:r>
+        <w:rPr>
+          <w:i/>
+          <w:color w:val="555555"/>
+          <w:sz w:val="20"/>
+        </w:rPr>
+        <w:t>gets wrong: Relying on money alone can ignore urgent technical or security issues.</w:t>
+      </w:r>
+    </w:p>
+    <w:p>
+      <w:pPr>
+        <w:spacing w:after="40"/>
+        <w:ind w:left="864"/>
+      </w:pPr>
+      <w:r>
+        <w:rPr>
+          <w:i w:val="0"/>
+          <w:color w:val="111111"/>
+          <w:sz w:val="20"/>
+        </w:rPr>
+        <w:t>4. fairness</w:t>
+      </w:r>
+    </w:p>
+    <w:p>
+      <w:pPr>
+        <w:spacing w:after="40"/>
+        <w:ind w:left="1296"/>
+      </w:pPr>
+      <w:r>
+        <w:rPr>
+          <w:i/>
+          <w:color w:val="555555"/>
+          <w:sz w:val="20"/>
+        </w:rPr>
+        <w:t>why here: Fairness (e.g., repeat contacts) is a useful tie‑breaker but less decisive than concrete impact or commitments.</w:t>
+      </w:r>
+    </w:p>
+    <w:p>
+      <w:pPr>
+        <w:spacing w:after="40"/>
+        <w:ind w:left="1296"/>
+      </w:pPr>
+      <w:r>
+        <w:rPr>
+          <w:i/>
+          <w:color w:val="555555"/>
+          <w:sz w:val="20"/>
+        </w:rPr>
+        <w:t>gets wrong: It is subjective and may not reflect actual severity or contractual obligations.</w:t>
+      </w:r>
+    </w:p>
+    <w:p>
+      <w:pPr>
+        <w:spacing w:after="40"/>
+        <w:ind w:left="0"/>
+      </w:pPr>
+      <w:r>
+        <w:rPr>
+          <w:i w:val="0"/>
+          <w:color w:val="111111"/>
+          <w:sz w:val="20"/>
+        </w:rPr>
+      </w:r>
+    </w:p>
+    <w:p>
+      <w:pPr>
+        <w:spacing w:after="40"/>
+        <w:ind w:left="432"/>
+      </w:pPr>
+      <w:r>
+        <w:rPr>
+          <w:i w:val="0"/>
+          <w:color w:val="111111"/>
+          <w:sz w:val="20"/>
+        </w:rPr>
+        <w:t>Closest call between the four:</w:t>
+      </w:r>
+    </w:p>
+    <w:p>
+      <w:pPr>
+        <w:spacing w:after="40"/>
+        <w:ind w:left="864"/>
+      </w:pPr>
+      <w:r>
+        <w:rPr>
+          <w:i/>
+          <w:color w:val="555555"/>
+          <w:sz w:val="20"/>
+        </w:rPr>
+        <w:t>Damage outranked deadline because the data‑loss ticket blocked work for thousands, a far greater harm than any missed SLA.</w:t>
+      </w:r>
+    </w:p>
+    <w:p>
+      <w:pPr>
+        <w:spacing w:before="240" w:after="60"/>
+      </w:pPr>
+      <w:r>
+        <w:rPr>
+          <w:b/>
+          <w:color w:val="6D28D9"/>
+          <w:sz w:val="23"/>
+        </w:rPr>
+        <w:t>Step 6   Check the answer before anything happens</w:t>
+      </w:r>
+    </w:p>
+    <w:p>
+      <w:pPr>
+        <w:spacing w:after="40"/>
+        <w:ind w:left="432"/>
+      </w:pPr>
+      <w:r>
+        <w:rPr>
+          <w:i w:val="0"/>
+          <w:color w:val="111111"/>
+          <w:sz w:val="20"/>
+        </w:rPr>
+        <w:t>Did every complaint come back, and were the written rules followed?</w:t>
+      </w:r>
+    </w:p>
+    <w:p>
+      <w:pPr>
+        <w:spacing w:after="40"/>
+        <w:ind w:left="864"/>
+      </w:pPr>
+      <w:r>
+        <w:rPr>
+          <w:i/>
+          <w:color w:val="555555"/>
+          <w:sz w:val="20"/>
+        </w:rPr>
+        <w:t>Yes. Nothing was dropped and no rule was broken.</w:t>
+      </w:r>
+    </w:p>
+    <w:p>
+      <w:pPr>
+        <w:spacing w:after="40"/>
+        <w:ind w:left="0"/>
+      </w:pPr>
+      <w:r>
+        <w:rPr>
+          <w:i w:val="0"/>
+          <w:color w:val="111111"/>
+          <w:sz w:val="20"/>
+        </w:rPr>
+      </w:r>
+    </w:p>
+    <w:p>
+      <w:pPr>
+        <w:spacing w:after="40"/>
+        <w:ind w:left="432"/>
+      </w:pPr>
+      <w:r>
+        <w:rPr>
+          <w:i w:val="0"/>
+          <w:color w:val="111111"/>
+          <w:sz w:val="20"/>
+        </w:rPr>
+        <w:t>Were the reasons it gave actually true?</w:t>
+      </w:r>
+    </w:p>
+    <w:p>
+      <w:pPr>
+        <w:spacing w:after="40"/>
+        <w:ind w:left="864"/>
+      </w:pPr>
+      <w:r>
+        <w:rPr>
+          <w:i/>
+          <w:color w:val="555555"/>
+          <w:sz w:val="20"/>
+        </w:rPr>
+        <w:t>Yes. Every reason matched the numbers we hold.</w:t>
+      </w:r>
+    </w:p>
+    <w:p>
+      <w:pPr>
+        <w:spacing w:after="40"/>
+        <w:ind w:left="0"/>
+      </w:pPr>
+      <w:r>
+        <w:rPr>
+          <w:i w:val="0"/>
+          <w:color w:val="111111"/>
+          <w:sz w:val="20"/>
+        </w:rPr>
+      </w:r>
+    </w:p>
+    <w:p>
+      <w:pPr>
+        <w:spacing w:after="40"/>
+        <w:ind w:left="432"/>
+      </w:pPr>
+      <w:r>
+        <w:rPr>
+          <w:i w:val="0"/>
+          <w:color w:val="111111"/>
+          <w:sz w:val="20"/>
+        </w:rPr>
+        <w:t>How solid was the answer? One number was changed at a time and everything ranked again, to see which places were close calls.</w:t>
+      </w:r>
+    </w:p>
+    <w:p>
+      <w:pPr>
+        <w:spacing w:after="40"/>
+        <w:ind w:left="864"/>
+      </w:pPr>
+      <w:r>
+        <w:rPr>
+          <w:i w:val="0"/>
+          <w:color w:val="555555"/>
+          <w:sz w:val="18"/>
+        </w:rPr>
+        <w:t>TICK-00707  shaky  (3 of 7 small changes move it)</w:t>
+      </w:r>
+    </w:p>
+    <w:p>
+      <w:pPr>
+        <w:spacing w:after="40"/>
+        <w:ind w:left="1296"/>
+      </w:pPr>
+      <w:r>
+        <w:rPr>
+          <w:i/>
+          <w:color w:val="555555"/>
+          <w:sz w:val="18"/>
+        </w:rPr>
+        <w:t>if work was blocked after all, it moves from 4 to 3</w:t>
+      </w:r>
+    </w:p>
+    <w:p>
+      <w:pPr>
+        <w:spacing w:after="40"/>
+        <w:ind w:left="1296"/>
+      </w:pPr>
+      <w:r>
+        <w:rPr>
+          <w:i/>
+          <w:color w:val="555555"/>
+          <w:sz w:val="18"/>
+        </w:rPr>
+        <w:t>if we had a quarter less time left than we thought, it moves from 4 to 2</w:t>
+      </w:r>
+    </w:p>
+    <w:p>
+      <w:pPr>
+        <w:spacing w:after="40"/>
+        <w:ind w:left="864"/>
+      </w:pPr>
+      <w:r>
+        <w:rPr>
+          <w:i w:val="0"/>
+          <w:color w:val="555555"/>
+          <w:sz w:val="18"/>
+        </w:rPr>
+        <w:t>TICK-00171  fairly solid  (1 of 6 small changes move it)</w:t>
+      </w:r>
+    </w:p>
+    <w:p>
+      <w:pPr>
+        <w:spacing w:after="40"/>
+        <w:ind w:left="1296"/>
+      </w:pPr>
+      <w:r>
+        <w:rPr>
+          <w:i/>
+          <w:color w:val="555555"/>
+          <w:sz w:val="18"/>
+        </w:rPr>
+        <w:t>if we had a quarter more time left than we thought, it moves from 2 to 4</w:t>
+      </w:r>
+    </w:p>
+    <w:p>
+      <w:pPr>
+        <w:spacing w:after="40"/>
+        <w:ind w:left="864"/>
+      </w:pPr>
+      <w:r>
+        <w:rPr>
+          <w:i w:val="0"/>
+          <w:color w:val="555555"/>
+          <w:sz w:val="18"/>
+        </w:rPr>
+        <w:t>TICK-00771  shaky  (3 of 6 small changes move it)</w:t>
+      </w:r>
+    </w:p>
+    <w:p>
+      <w:pPr>
+        <w:spacing w:after="40"/>
+        <w:ind w:left="1296"/>
+      </w:pPr>
+      <w:r>
+        <w:rPr>
+          <w:i/>
+          <w:color w:val="555555"/>
+          <w:sz w:val="18"/>
+        </w:rPr>
+        <w:t>if 7 people were affected, not 1, it moves from 5 to 4</w:t>
+      </w:r>
+    </w:p>
+    <w:p>
+      <w:pPr>
+        <w:spacing w:after="40"/>
+        <w:ind w:left="1296"/>
+      </w:pPr>
+      <w:r>
+        <w:rPr>
+          <w:i/>
+          <w:color w:val="555555"/>
+          <w:sz w:val="18"/>
+        </w:rPr>
+        <w:t>if work was blocked after all, it moves from 5 to 3</w:t>
+      </w:r>
+    </w:p>
+    <w:p>
+      <w:pPr>
+        <w:spacing w:after="40"/>
+        <w:ind w:left="864"/>
+      </w:pPr>
+      <w:r>
+        <w:rPr>
+          <w:i w:val="0"/>
+          <w:color w:val="555555"/>
+          <w:sz w:val="18"/>
+        </w:rPr>
+        <w:t>TICK-00266  fairly solid  (2 of 6 small changes move it)</w:t>
+      </w:r>
+    </w:p>
+    <w:p>
+      <w:pPr>
+        <w:spacing w:after="40"/>
+        <w:ind w:left="1296"/>
+      </w:pPr>
+      <w:r>
+        <w:rPr>
+          <w:i/>
+          <w:color w:val="555555"/>
+          <w:sz w:val="18"/>
+        </w:rPr>
+        <w:t>if 7 people were affected, not 1, it moves from 3 to 2</w:t>
+      </w:r>
+    </w:p>
+    <w:p>
+      <w:pPr>
+        <w:spacing w:after="40"/>
+        <w:ind w:left="1296"/>
+      </w:pPr>
+      <w:r>
+        <w:rPr>
+          <w:i/>
+          <w:color w:val="555555"/>
+          <w:sz w:val="18"/>
+        </w:rPr>
+        <w:t>if work was blocked after all, it moves from 3 to 2</w:t>
+      </w:r>
+    </w:p>
+    <w:p>
+      <w:pPr>
+        <w:spacing w:after="40"/>
+        <w:ind w:left="864"/>
+      </w:pPr>
+      <w:r>
+        <w:rPr>
+          <w:i w:val="0"/>
+          <w:color w:val="555555"/>
+          <w:sz w:val="18"/>
+        </w:rPr>
+        <w:t>TICK-00982  solid  (0 of 7 small changes move it)</w:t>
+      </w:r>
+    </w:p>
+    <w:p>
+      <w:pPr>
+        <w:spacing w:after="40"/>
+        <w:ind w:left="864"/>
+      </w:pPr>
+      <w:r>
+        <w:rPr>
+          <w:i w:val="0"/>
+          <w:color w:val="555555"/>
+          <w:sz w:val="18"/>
+        </w:rPr>
+        <w:t>TICK-00135  fairly solid  (1 of 6 small changes move it)</w:t>
+      </w:r>
+    </w:p>
+    <w:p>
+      <w:pPr>
+        <w:spacing w:after="40"/>
+        <w:ind w:left="1296"/>
+      </w:pPr>
+      <w:r>
+        <w:rPr>
+          <w:i/>
+          <w:color w:val="555555"/>
+          <w:sz w:val="18"/>
+        </w:rPr>
+        <w:t>if work was blocked after all, it moves from 6 to 5</w:t>
+      </w:r>
+    </w:p>
+    <w:p>
+      <w:pPr>
+        <w:spacing w:before="240" w:after="60"/>
+      </w:pPr>
+      <w:r>
+        <w:rPr>
+          <w:b/>
+          <w:color w:val="6D28D9"/>
+          <w:sz w:val="23"/>
+        </w:rPr>
+        <w:t>Step 7   Hand them to a person</w:t>
+      </w:r>
+    </w:p>
+    <w:p>
+      <w:pPr>
+        <w:spacing w:after="40"/>
+        <w:ind w:left="432"/>
+      </w:pPr>
+      <w:r>
+        <w:rPr>
+          <w:i w:val="0"/>
+          <w:color w:val="555555"/>
+          <w:sz w:val="18"/>
+        </w:rPr>
+        <w:t>TICK-00171 goes to a person now</w:t>
+      </w:r>
+    </w:p>
+    <w:p>
+      <w:pPr>
+        <w:spacing w:after="40"/>
+        <w:ind w:left="432"/>
+      </w:pPr>
+      <w:r>
+        <w:rPr>
+          <w:i w:val="0"/>
+          <w:color w:val="555555"/>
+          <w:sz w:val="18"/>
+        </w:rPr>
+        <w:t>TICK-00771 goes to a person next   (the numbers were not settled about this one)</w:t>
+      </w:r>
+    </w:p>
+    <w:p>
+      <w:pPr>
+        <w:spacing w:after="40"/>
+        <w:ind w:left="432"/>
+      </w:pPr>
+      <w:r>
+        <w:rPr>
+          <w:i w:val="0"/>
+          <w:color w:val="555555"/>
+          <w:sz w:val="18"/>
+        </w:rPr>
+        <w:t>TICK-00982 goes to a person next</w:t>
+      </w:r>
+    </w:p>
+    <w:p>
+      <w:pPr>
+        <w:spacing w:after="40"/>
+        <w:ind w:left="432"/>
+      </w:pPr>
+      <w:r>
+        <w:rPr>
+          <w:i w:val="0"/>
+          <w:color w:val="555555"/>
+          <w:sz w:val="18"/>
+        </w:rPr>
+        <w:t>TICK-00266 goes to a person queued</w:t>
+      </w:r>
+    </w:p>
+    <w:p>
+      <w:pPr>
+        <w:spacing w:after="40"/>
+        <w:ind w:left="432"/>
+      </w:pPr>
+      <w:r>
+        <w:rPr>
+          <w:i w:val="0"/>
+          <w:color w:val="555555"/>
+          <w:sz w:val="18"/>
+        </w:rPr>
+        <w:t>TICK-00707 goes to a person queued   (the numbers were not settled about this one)</w:t>
+      </w:r>
+    </w:p>
+    <w:p>
+      <w:pPr>
+        <w:spacing w:after="40"/>
+        <w:ind w:left="432"/>
+      </w:pPr>
+      <w:r>
+        <w:rPr>
+          <w:i w:val="0"/>
+          <w:color w:val="555555"/>
+          <w:sz w:val="18"/>
+        </w:rPr>
+        <w:t>TICK-00135 goes to a person queued</w:t>
       </w:r>
     </w:p>
     <w:p/>

</xml_diff>